<commit_message>
Update doc generation for docs/md sources
</commit_message>
<xml_diff>
--- a/docs/docx/Documentation_Guide.docx
+++ b/docs/docx/Documentation_Guide.docx
@@ -3020,7 +3020,7 @@
       <w:pPr>
         <w:autoSpaceDN w:val="0"/>
         <w:tabs>
-          <w:tab w:pos="500" w:val="left"/>
+          <w:tab w:pos="506" w:val="left"/>
         </w:tabs>
         <w:autoSpaceDE w:val="0"/>
         <w:widowControl/>
@@ -3040,7 +3040,6 @@
       </w:r>
       <w:r>
         <w:rPr>
-          <w:w w:val="98.62537384033203"/>
           <w:rFonts w:ascii="LMRoman12" w:hAnsi="LMRoman12" w:eastAsia="LMRoman12"/>
           <w:b w:val="0"/>
           <w:i w:val="0"/>
@@ -3051,7 +3050,6 @@
       </w:r>
       <w:r>
         <w:rPr>
-          <w:w w:val="98.62537384033203"/>
           <w:rFonts w:ascii="LMRoman12" w:hAnsi="LMRoman12" w:eastAsia="LMRoman12"/>
           <w:b/>
           <w:i w:val="0"/>
@@ -3062,7 +3060,6 @@
       </w:r>
       <w:r>
         <w:rPr>
-          <w:w w:val="98.62537384033203"/>
           <w:rFonts w:ascii="LMRoman12" w:hAnsi="LMRoman12" w:eastAsia="LMRoman12"/>
           <w:b w:val="0"/>
           <w:i w:val="0"/>
@@ -3073,7 +3070,6 @@
       </w:r>
       <w:r>
         <w:rPr>
-          <w:w w:val="98.62537384033203"/>
           <w:rFonts w:ascii="LMRoman12" w:hAnsi="LMRoman12" w:eastAsia="LMRoman12"/>
           <w:b w:val="0"/>
           <w:i w:val="0"/>
@@ -3084,7 +3080,6 @@
       </w:r>
       <w:r>
         <w:rPr>
-          <w:w w:val="98.62537384033203"/>
           <w:rFonts w:ascii="LMRoman12" w:hAnsi="LMRoman12" w:eastAsia="LMRoman12"/>
           <w:b w:val="0"/>
           <w:i w:val="0"/>
@@ -3095,7 +3090,6 @@
       </w:r>
       <w:r>
         <w:rPr>
-          <w:w w:val="98.62537384033203"/>
           <w:rFonts w:ascii="LMRoman12" w:hAnsi="LMRoman12" w:eastAsia="LMRoman12"/>
           <w:b w:val="0"/>
           <w:i w:val="0"/>
@@ -3106,7 +3100,6 @@
       </w:r>
       <w:r>
         <w:rPr>
-          <w:w w:val="98.62537384033203"/>
           <w:rFonts w:ascii="LMRoman12" w:hAnsi="LMRoman12" w:eastAsia="LMRoman12"/>
           <w:b w:val="0"/>
           <w:i w:val="0"/>
@@ -3117,7 +3110,6 @@
       </w:r>
       <w:r>
         <w:rPr>
-          <w:w w:val="98.62537384033203"/>
           <w:rFonts w:ascii="LMRoman12" w:hAnsi="LMRoman12" w:eastAsia="LMRoman12"/>
           <w:b w:val="0"/>
           <w:i w:val="0"/>
@@ -3128,7 +3120,6 @@
       </w:r>
       <w:r>
         <w:rPr>
-          <w:w w:val="98.62537384033203"/>
           <w:rFonts w:ascii="LMRoman12" w:hAnsi="LMRoman12" w:eastAsia="LMRoman12"/>
           <w:b w:val="0"/>
           <w:i w:val="0"/>
@@ -3139,40 +3130,16 @@
       </w:r>
       <w:r>
         <w:rPr>
-          <w:w w:val="98.62537384033203"/>
-          <w:rFonts w:ascii="LMRoman12" w:hAnsi="LMRoman12" w:eastAsia="LMRoman12"/>
-          <w:b w:val="0"/>
-          <w:i w:val="0"/>
-          <w:color w:val="000000"/>
-          <w:sz w:val="24"/>
-        </w:rPr>
-        <w:t>at</w:t>
-      </w:r>
-      <w:r>
-        <w:rPr>
-          <w:w w:val="98.62537384033203"/>
-          <w:rFonts w:ascii="LMRoman12" w:hAnsi="LMRoman12" w:eastAsia="LMRoman12"/>
-          <w:b w:val="0"/>
-          <w:i w:val="0"/>
-          <w:color w:val="000000"/>
-          <w:sz w:val="24"/>
-        </w:rPr>
-        <w:t>the</w:t>
-      </w:r>
-      <w:r>
-        <w:rPr>
-          <w:w w:val="98.62537384033203"/>
-          <w:rFonts w:ascii="LMRoman12" w:hAnsi="LMRoman12" w:eastAsia="LMRoman12"/>
-          <w:b w:val="0"/>
-          <w:i w:val="0"/>
-          <w:color w:val="000000"/>
-          <w:sz w:val="24"/>
-        </w:rPr>
-        <w:t>time</w:t>
-      </w:r>
-      <w:r>
-        <w:rPr>
-          <w:w w:val="98.62537384033203"/>
+          <w:rFonts w:ascii="LMRoman12" w:hAnsi="LMRoman12" w:eastAsia="LMRoman12"/>
+          <w:b w:val="0"/>
+          <w:i w:val="0"/>
+          <w:color w:val="000000"/>
+          <w:sz w:val="24"/>
+        </w:rPr>
+        <w:t>when</w:t>
+      </w:r>
+      <w:r>
+        <w:rPr>
           <w:rFonts w:ascii="LMRoman12" w:hAnsi="LMRoman12" w:eastAsia="LMRoman12"/>
           <w:b w:val="0"/>
           <w:i w:val="0"/>
@@ -3183,44 +3150,36 @@
       </w:r>
       <w:r>
         <w:rPr>
-          <w:w w:val="98.62537384033203"/>
-          <w:rFonts w:ascii="LMRoman12" w:hAnsi="LMRoman12" w:eastAsia="LMRoman12"/>
-          <w:b w:val="0"/>
-          <w:i w:val="0"/>
-          <w:color w:val="000000"/>
-          <w:sz w:val="24"/>
-        </w:rPr>
-        <w:t xml:space="preserve">document </w:t>
-      </w:r>
-      <w:r>
-        <w:rPr>
-          <w:rFonts w:ascii="LMRoman12" w:hAnsi="LMRoman12" w:eastAsia="LMRoman12"/>
-          <w:b w:val="0"/>
-          <w:i w:val="0"/>
-          <w:color w:val="000000"/>
-          <w:sz w:val="24"/>
-        </w:rPr>
-        <w:t>version</w:t>
-      </w:r>
-      <w:r>
-        <w:rPr>
-          <w:rFonts w:ascii="LMRoman12" w:hAnsi="LMRoman12" w:eastAsia="LMRoman12"/>
-          <w:b w:val="0"/>
-          <w:i w:val="0"/>
-          <w:color w:val="000000"/>
-          <w:sz w:val="24"/>
-        </w:rPr>
-        <w:t>was</w:t>
-      </w:r>
-      <w:r>
-        <w:rPr>
-          <w:rFonts w:ascii="LMRoman12" w:hAnsi="LMRoman12" w:eastAsia="LMRoman12"/>
-          <w:b w:val="0"/>
-          <w:i w:val="0"/>
-          <w:color w:val="000000"/>
-          <w:sz w:val="24"/>
-        </w:rPr>
-        <w:t>published</w:t>
+          <w:rFonts w:ascii="LMRoman12" w:hAnsi="LMRoman12" w:eastAsia="LMRoman12"/>
+          <w:b w:val="0"/>
+          <w:i w:val="0"/>
+          <w:color w:val="000000"/>
+          <w:sz w:val="24"/>
+        </w:rPr>
+        <w:t>document</w:t>
+      </w:r>
+      <w:r>
+        <w:rPr>
+          <w:rFonts w:ascii="LMRoman12" w:hAnsi="LMRoman12" w:eastAsia="LMRoman12"/>
+          <w:b w:val="0"/>
+          <w:i w:val="0"/>
+          <w:color w:val="000000"/>
+          <w:sz w:val="24"/>
+        </w:rPr>
+        <w:t xml:space="preserve">was </w:t>
+      </w:r>
+      <w:r>
+        <w:tab/>
+      </w:r>
+      <w:r>
+        <w:rPr>
+          <w:rFonts w:ascii="LMRoman12" w:hAnsi="LMRoman12" w:eastAsia="LMRoman12"/>
+          <w:b w:val="0"/>
+          <w:i w:val="0"/>
+          <w:color w:val="000000"/>
+          <w:sz w:val="24"/>
+        </w:rPr>
+        <w:t>released</w:t>
       </w:r>
       <w:r>
         <w:rPr>
@@ -3297,7 +3256,7 @@
       <w:pPr>
         <w:autoSpaceDN w:val="0"/>
         <w:tabs>
-          <w:tab w:pos="498" w:val="left"/>
+          <w:tab w:pos="506" w:val="left"/>
         </w:tabs>
         <w:autoSpaceDE w:val="0"/>
         <w:widowControl/>
@@ -3335,7 +3294,7 @@
           <w:color w:val="000000"/>
           <w:sz w:val="24"/>
         </w:rPr>
-        <w:t xml:space="preserve"> Test</w:t>
+        <w:t>Test</w:t>
       </w:r>
       <w:r>
         <w:rPr>
@@ -3346,7 +3305,128 @@
           <w:color w:val="000000"/>
           <w:sz w:val="24"/>
         </w:rPr>
-        <w:t xml:space="preserve"> column records the Test API version current at the time this document version </w:t>
+        <w:t>column</w:t>
+      </w:r>
+      <w:r>
+        <w:rPr>
+          <w:w w:val="98.62537384033203"/>
+          <w:rFonts w:ascii="LMRoman12" w:hAnsi="LMRoman12" w:eastAsia="LMRoman12"/>
+          <w:b w:val="0"/>
+          <w:i w:val="0"/>
+          <w:color w:val="000000"/>
+          <w:sz w:val="24"/>
+        </w:rPr>
+        <w:t>records</w:t>
+      </w:r>
+      <w:r>
+        <w:rPr>
+          <w:w w:val="98.62537384033203"/>
+          <w:rFonts w:ascii="LMRoman12" w:hAnsi="LMRoman12" w:eastAsia="LMRoman12"/>
+          <w:b w:val="0"/>
+          <w:i w:val="0"/>
+          <w:color w:val="000000"/>
+          <w:sz w:val="24"/>
+        </w:rPr>
+        <w:t>the</w:t>
+      </w:r>
+      <w:r>
+        <w:rPr>
+          <w:w w:val="98.62537384033203"/>
+          <w:rFonts w:ascii="LMRoman12" w:hAnsi="LMRoman12" w:eastAsia="LMRoman12"/>
+          <w:b w:val="0"/>
+          <w:i w:val="0"/>
+          <w:color w:val="000000"/>
+          <w:sz w:val="24"/>
+        </w:rPr>
+        <w:t>Test</w:t>
+      </w:r>
+      <w:r>
+        <w:rPr>
+          <w:w w:val="98.62537384033203"/>
+          <w:rFonts w:ascii="LMRoman12" w:hAnsi="LMRoman12" w:eastAsia="LMRoman12"/>
+          <w:b w:val="0"/>
+          <w:i w:val="0"/>
+          <w:color w:val="000000"/>
+          <w:sz w:val="24"/>
+        </w:rPr>
+        <w:t>API</w:t>
+      </w:r>
+      <w:r>
+        <w:rPr>
+          <w:w w:val="98.62537384033203"/>
+          <w:rFonts w:ascii="LMRoman12" w:hAnsi="LMRoman12" w:eastAsia="LMRoman12"/>
+          <w:b w:val="0"/>
+          <w:i w:val="0"/>
+          <w:color w:val="000000"/>
+          <w:sz w:val="24"/>
+        </w:rPr>
+        <w:t>version</w:t>
+      </w:r>
+      <w:r>
+        <w:rPr>
+          <w:w w:val="98.62537384033203"/>
+          <w:rFonts w:ascii="LMRoman12" w:hAnsi="LMRoman12" w:eastAsia="LMRoman12"/>
+          <w:b w:val="0"/>
+          <w:i w:val="0"/>
+          <w:color w:val="000000"/>
+          <w:sz w:val="24"/>
+        </w:rPr>
+        <w:t>current</w:t>
+      </w:r>
+      <w:r>
+        <w:rPr>
+          <w:w w:val="98.62537384033203"/>
+          <w:rFonts w:ascii="LMRoman12" w:hAnsi="LMRoman12" w:eastAsia="LMRoman12"/>
+          <w:b w:val="0"/>
+          <w:i w:val="0"/>
+          <w:color w:val="000000"/>
+          <w:sz w:val="24"/>
+        </w:rPr>
+        <w:t>when</w:t>
+      </w:r>
+      <w:r>
+        <w:rPr>
+          <w:w w:val="98.62537384033203"/>
+          <w:rFonts w:ascii="LMRoman12" w:hAnsi="LMRoman12" w:eastAsia="LMRoman12"/>
+          <w:b w:val="0"/>
+          <w:i w:val="0"/>
+          <w:color w:val="000000"/>
+          <w:sz w:val="24"/>
+        </w:rPr>
+        <w:t>this</w:t>
+      </w:r>
+      <w:r>
+        <w:rPr>
+          <w:w w:val="98.62537384033203"/>
+          <w:rFonts w:ascii="LMRoman12" w:hAnsi="LMRoman12" w:eastAsia="LMRoman12"/>
+          <w:b w:val="0"/>
+          <w:i w:val="0"/>
+          <w:color w:val="000000"/>
+          <w:sz w:val="24"/>
+        </w:rPr>
+        <w:t>document</w:t>
+      </w:r>
+      <w:r>
+        <w:rPr>
+          <w:w w:val="98.62537384033203"/>
+          <w:rFonts w:ascii="LMRoman12" w:hAnsi="LMRoman12" w:eastAsia="LMRoman12"/>
+          <w:b w:val="0"/>
+          <w:i w:val="0"/>
+          <w:color w:val="000000"/>
+          <w:sz w:val="24"/>
+        </w:rPr>
+        <w:t>was</w:t>
+      </w:r>
+      <w:r>
+        <w:rPr>
+          <w:w w:val="98.62537384033203"/>
+          <w:rFonts w:ascii="LMRoman12" w:hAnsi="LMRoman12" w:eastAsia="LMRoman12"/>
+          <w:b w:val="0"/>
+          <w:i w:val="0"/>
+          <w:color w:val="000000"/>
+          <w:sz w:val="24"/>
+        </w:rPr>
+        <w:t xml:space="preserve">released </w:t>
       </w:r>
       <w:r>
         <w:tab/>
@@ -3359,26 +3439,6 @@
           <w:color w:val="000000"/>
           <w:sz w:val="24"/>
         </w:rPr>
-        <w:t>was</w:t>
-      </w:r>
-      <w:r>
-        <w:rPr>
-          <w:rFonts w:ascii="LMRoman12" w:hAnsi="LMRoman12" w:eastAsia="LMRoman12"/>
-          <w:b w:val="0"/>
-          <w:i w:val="0"/>
-          <w:color w:val="000000"/>
-          <w:sz w:val="24"/>
-        </w:rPr>
-        <w:t>published</w:t>
-      </w:r>
-      <w:r>
-        <w:rPr>
-          <w:rFonts w:ascii="LMRoman12" w:hAnsi="LMRoman12" w:eastAsia="LMRoman12"/>
-          <w:b w:val="0"/>
-          <w:i w:val="0"/>
-          <w:color w:val="000000"/>
-          <w:sz w:val="24"/>
-        </w:rPr>
         <w:t>and</w:t>
       </w:r>
       <w:r>
@@ -3440,6 +3500,182 @@
           <w:sz w:val="24"/>
         </w:rPr>
         <w:t>macro.</w:t>
+      </w:r>
+    </w:p>
+    <w:p>
+      <w:pPr>
+        <w:autoSpaceDN w:val="0"/>
+        <w:tabs>
+          <w:tab w:pos="506" w:val="left"/>
+        </w:tabs>
+        <w:autoSpaceDE w:val="0"/>
+        <w:widowControl/>
+        <w:spacing w:line="278" w:lineRule="exact" w:before="2" w:after="0"/>
+        <w:ind w:left="224" w:right="0" w:firstLine="0"/>
+        <w:jc w:val="left"/>
+      </w:pPr>
+      <w:r>
+        <w:rPr>
+          <w:rFonts w:ascii="LMRoman12" w:hAnsi="LMRoman12" w:eastAsia="LMRoman12"/>
+          <w:b w:val="0"/>
+          <w:i w:val="0"/>
+          <w:color w:val="000000"/>
+          <w:sz w:val="24"/>
+        </w:rPr>
+        <w:t>•</w:t>
+      </w:r>
+      <w:r>
+        <w:rPr>
+          <w:rFonts w:ascii="LMRoman12" w:hAnsi="LMRoman12" w:eastAsia="LMRoman12"/>
+          <w:b w:val="0"/>
+          <w:i w:val="0"/>
+          <w:color w:val="000000"/>
+          <w:sz w:val="24"/>
+        </w:rPr>
+        <w:t>Both</w:t>
+      </w:r>
+      <w:r>
+        <w:rPr>
+          <w:rFonts w:ascii="LMRoman12" w:hAnsi="LMRoman12" w:eastAsia="LMRoman12"/>
+          <w:b w:val="0"/>
+          <w:i w:val="0"/>
+          <w:color w:val="000000"/>
+          <w:sz w:val="24"/>
+        </w:rPr>
+        <w:t>the</w:t>
+      </w:r>
+      <w:r>
+        <w:rPr>
+          <w:rFonts w:ascii="LMRoman12" w:hAnsi="LMRoman12" w:eastAsia="LMRoman12"/>
+          <w:b w:val="0"/>
+          <w:i w:val="0"/>
+          <w:color w:val="000000"/>
+          <w:sz w:val="24"/>
+        </w:rPr>
+        <w:t>Runner</w:t>
+      </w:r>
+      <w:r>
+        <w:rPr>
+          <w:rFonts w:ascii="LMRoman12" w:hAnsi="LMRoman12" w:eastAsia="LMRoman12"/>
+          <w:b w:val="0"/>
+          <w:i w:val="0"/>
+          <w:color w:val="000000"/>
+          <w:sz w:val="24"/>
+        </w:rPr>
+        <w:t>API</w:t>
+      </w:r>
+      <w:r>
+        <w:rPr>
+          <w:rFonts w:ascii="LMRoman12" w:hAnsi="LMRoman12" w:eastAsia="LMRoman12"/>
+          <w:b w:val="0"/>
+          <w:i w:val="0"/>
+          <w:color w:val="000000"/>
+          <w:sz w:val="24"/>
+        </w:rPr>
+        <w:t>and</w:t>
+      </w:r>
+      <w:r>
+        <w:rPr>
+          <w:rFonts w:ascii="LMRoman12" w:hAnsi="LMRoman12" w:eastAsia="LMRoman12"/>
+          <w:b w:val="0"/>
+          <w:i w:val="0"/>
+          <w:color w:val="000000"/>
+          <w:sz w:val="24"/>
+        </w:rPr>
+        <w:t>Test</w:t>
+      </w:r>
+      <w:r>
+        <w:rPr>
+          <w:rFonts w:ascii="LMRoman12" w:hAnsi="LMRoman12" w:eastAsia="LMRoman12"/>
+          <w:b w:val="0"/>
+          <w:i w:val="0"/>
+          <w:color w:val="000000"/>
+          <w:sz w:val="24"/>
+        </w:rPr>
+        <w:t>API</w:t>
+      </w:r>
+      <w:r>
+        <w:rPr>
+          <w:rFonts w:ascii="LMRoman12" w:hAnsi="LMRoman12" w:eastAsia="LMRoman12"/>
+          <w:b w:val="0"/>
+          <w:i w:val="0"/>
+          <w:color w:val="000000"/>
+          <w:sz w:val="24"/>
+        </w:rPr>
+        <w:t>use</w:t>
+      </w:r>
+      <w:r>
+        <w:rPr>
+          <w:rFonts w:ascii="LMRoman12" w:hAnsi="LMRoman12" w:eastAsia="LMRoman12"/>
+          <w:b w:val="0"/>
+          <w:i w:val="0"/>
+          <w:color w:val="000000"/>
+          <w:sz w:val="24"/>
+        </w:rPr>
+        <w:t>the</w:t>
+      </w:r>
+      <w:r>
+        <w:rPr>
+          <w:rFonts w:ascii="LMRoman12" w:hAnsi="LMRoman12" w:eastAsia="LMRoman12"/>
+          <w:b w:val="0"/>
+          <w:i w:val="0"/>
+          <w:color w:val="000000"/>
+          <w:sz w:val="24"/>
+        </w:rPr>
+        <w:t>version</w:t>
+      </w:r>
+      <w:r>
+        <w:rPr>
+          <w:rFonts w:ascii="LMRoman12" w:hAnsi="LMRoman12" w:eastAsia="LMRoman12"/>
+          <w:b w:val="0"/>
+          <w:i w:val="0"/>
+          <w:color w:val="000000"/>
+          <w:sz w:val="24"/>
+        </w:rPr>
+        <w:t>format</w:t>
+      </w:r>
+      <w:r>
+        <w:rPr>
+          <w:rFonts w:ascii="LMMono12" w:hAnsi="LMMono12" w:eastAsia="LMMono12"/>
+          <w:b w:val="0"/>
+          <w:i w:val="0"/>
+          <w:color w:val="000000"/>
+          <w:sz w:val="24"/>
+        </w:rPr>
+        <w:t>"M.m.p"</w:t>
+      </w:r>
+      <w:r>
+        <w:rPr>
+          <w:rFonts w:ascii="LMRoman12" w:hAnsi="LMRoman12" w:eastAsia="LMRoman12"/>
+          <w:b w:val="0"/>
+          <w:i w:val="0"/>
+          <w:color w:val="000000"/>
+          <w:sz w:val="24"/>
+        </w:rPr>
+        <w:t>(Major,</w:t>
+      </w:r>
+      <w:r>
+        <w:rPr>
+          <w:rFonts w:ascii="LMRoman12" w:hAnsi="LMRoman12" w:eastAsia="LMRoman12"/>
+          <w:b w:val="0"/>
+          <w:i w:val="0"/>
+          <w:color w:val="000000"/>
+          <w:sz w:val="24"/>
+        </w:rPr>
+        <w:t xml:space="preserve">minor, </w:t>
+      </w:r>
+      <w:r>
+        <w:tab/>
+      </w:r>
+      <w:r>
+        <w:rPr>
+          <w:rFonts w:ascii="LMRoman12" w:hAnsi="LMRoman12" w:eastAsia="LMRoman12"/>
+          <w:b w:val="0"/>
+          <w:i w:val="0"/>
+          <w:color w:val="000000"/>
+          <w:sz w:val="24"/>
+        </w:rPr>
+        <w:t>patch).</w:t>
       </w:r>
     </w:p>
     <w:p>
@@ -3447,140 +3683,10 @@
         <w:autoSpaceDN w:val="0"/>
         <w:autoSpaceDE w:val="0"/>
         <w:widowControl/>
-        <w:spacing w:line="278" w:lineRule="exact" w:before="2" w:after="0"/>
-        <w:ind w:left="224" w:right="864" w:firstLine="0"/>
+        <w:spacing w:line="240" w:lineRule="exact" w:before="40" w:after="0"/>
+        <w:ind w:left="224" w:right="0" w:firstLine="0"/>
         <w:jc w:val="left"/>
       </w:pPr>
-      <w:r>
-        <w:rPr>
-          <w:rFonts w:ascii="LMRoman12" w:hAnsi="LMRoman12" w:eastAsia="LMRoman12"/>
-          <w:b w:val="0"/>
-          <w:i w:val="0"/>
-          <w:color w:val="000000"/>
-          <w:sz w:val="24"/>
-        </w:rPr>
-        <w:t>•</w:t>
-      </w:r>
-      <w:r>
-        <w:rPr>
-          <w:rFonts w:ascii="LMRoman12" w:hAnsi="LMRoman12" w:eastAsia="LMRoman12"/>
-          <w:b w:val="0"/>
-          <w:i w:val="0"/>
-          <w:color w:val="000000"/>
-          <w:sz w:val="24"/>
-        </w:rPr>
-        <w:t>Both</w:t>
-      </w:r>
-      <w:r>
-        <w:rPr>
-          <w:rFonts w:ascii="LMRoman12" w:hAnsi="LMRoman12" w:eastAsia="LMRoman12"/>
-          <w:b w:val="0"/>
-          <w:i w:val="0"/>
-          <w:color w:val="000000"/>
-          <w:sz w:val="24"/>
-        </w:rPr>
-        <w:t>Runner</w:t>
-      </w:r>
-      <w:r>
-        <w:rPr>
-          <w:rFonts w:ascii="LMRoman12" w:hAnsi="LMRoman12" w:eastAsia="LMRoman12"/>
-          <w:b w:val="0"/>
-          <w:i w:val="0"/>
-          <w:color w:val="000000"/>
-          <w:sz w:val="24"/>
-        </w:rPr>
-        <w:t>and</w:t>
-      </w:r>
-      <w:r>
-        <w:rPr>
-          <w:rFonts w:ascii="LMRoman12" w:hAnsi="LMRoman12" w:eastAsia="LMRoman12"/>
-          <w:b w:val="0"/>
-          <w:i w:val="0"/>
-          <w:color w:val="000000"/>
-          <w:sz w:val="24"/>
-        </w:rPr>
-        <w:t>Test</w:t>
-      </w:r>
-      <w:r>
-        <w:rPr>
-          <w:rFonts w:ascii="LMRoman12" w:hAnsi="LMRoman12" w:eastAsia="LMRoman12"/>
-          <w:b w:val="0"/>
-          <w:i w:val="0"/>
-          <w:color w:val="000000"/>
-          <w:sz w:val="24"/>
-        </w:rPr>
-        <w:t>use</w:t>
-      </w:r>
-      <w:r>
-        <w:rPr>
-          <w:rFonts w:ascii="LMRoman12" w:hAnsi="LMRoman12" w:eastAsia="LMRoman12"/>
-          <w:b w:val="0"/>
-          <w:i w:val="0"/>
-          <w:color w:val="000000"/>
-          <w:sz w:val="24"/>
-        </w:rPr>
-        <w:t>the</w:t>
-      </w:r>
-      <w:r>
-        <w:rPr>
-          <w:rFonts w:ascii="LMRoman12" w:hAnsi="LMRoman12" w:eastAsia="LMRoman12"/>
-          <w:b w:val="0"/>
-          <w:i w:val="0"/>
-          <w:color w:val="000000"/>
-          <w:sz w:val="24"/>
-        </w:rPr>
-        <w:t>version</w:t>
-      </w:r>
-      <w:r>
-        <w:rPr>
-          <w:rFonts w:ascii="LMRoman12" w:hAnsi="LMRoman12" w:eastAsia="LMRoman12"/>
-          <w:b w:val="0"/>
-          <w:i w:val="0"/>
-          <w:color w:val="000000"/>
-          <w:sz w:val="24"/>
-        </w:rPr>
-        <w:t>format</w:t>
-      </w:r>
-      <w:r>
-        <w:rPr>
-          <w:rFonts w:ascii="LMMono12" w:hAnsi="LMMono12" w:eastAsia="LMMono12"/>
-          <w:b w:val="0"/>
-          <w:i w:val="0"/>
-          <w:color w:val="000000"/>
-          <w:sz w:val="24"/>
-        </w:rPr>
-        <w:t>"M.m.p"</w:t>
-      </w:r>
-      <w:r>
-        <w:rPr>
-          <w:rFonts w:ascii="LMRoman12" w:hAnsi="LMRoman12" w:eastAsia="LMRoman12"/>
-          <w:b w:val="0"/>
-          <w:i w:val="0"/>
-          <w:color w:val="000000"/>
-          <w:sz w:val="24"/>
-        </w:rPr>
-        <w:t>(Major,</w:t>
-      </w:r>
-      <w:r>
-        <w:rPr>
-          <w:rFonts w:ascii="LMRoman12" w:hAnsi="LMRoman12" w:eastAsia="LMRoman12"/>
-          <w:b w:val="0"/>
-          <w:i w:val="0"/>
-          <w:color w:val="000000"/>
-          <w:sz w:val="24"/>
-        </w:rPr>
-        <w:t>minor,</w:t>
-      </w:r>
-      <w:r>
-        <w:rPr>
-          <w:rFonts w:ascii="LMRoman12" w:hAnsi="LMRoman12" w:eastAsia="LMRoman12"/>
-          <w:b w:val="0"/>
-          <w:i w:val="0"/>
-          <w:color w:val="000000"/>
-          <w:sz w:val="24"/>
-        </w:rPr>
-        <w:t>patch).</w:t>
-      </w:r>
       <w:r>
         <w:rPr>
           <w:rFonts w:ascii="LMRoman12" w:hAnsi="LMRoman12" w:eastAsia="LMRoman12"/>
@@ -3707,7 +3813,7 @@
         <w:autoSpaceDN w:val="0"/>
         <w:autoSpaceDE w:val="0"/>
         <w:widowControl/>
-        <w:spacing w:line="278" w:lineRule="exact" w:before="120" w:after="6840"/>
+        <w:spacing w:line="278" w:lineRule="exact" w:before="120" w:after="6560"/>
         <w:ind w:left="8" w:right="44" w:hanging="8"/>
         <w:jc w:val="both"/>
       </w:pPr>
@@ -3843,7 +3949,6 @@
       </w:r>
       <w:r>
         <w:rPr>
-          <w:w w:val="98.97697766621908"/>
           <w:rFonts w:ascii="LMRoman12" w:hAnsi="LMRoman12" w:eastAsia="LMRoman12"/>
           <w:b w:val="0"/>
           <w:i w:val="0"/>
@@ -3854,7 +3959,6 @@
       </w:r>
       <w:r>
         <w:rPr>
-          <w:w w:val="98.97697766621908"/>
           <w:rFonts w:ascii="LMRoman12" w:hAnsi="LMRoman12" w:eastAsia="LMRoman12"/>
           <w:b w:val="0"/>
           <w:i w:val="0"/>
@@ -3865,7 +3969,6 @@
       </w:r>
       <w:r>
         <w:rPr>
-          <w:w w:val="98.97697766621908"/>
           <w:rFonts w:ascii="LMRoman12" w:hAnsi="LMRoman12" w:eastAsia="LMRoman12"/>
           <w:b w:val="0"/>
           <w:i w:val="0"/>
@@ -3876,7 +3979,6 @@
       </w:r>
       <w:r>
         <w:rPr>
-          <w:w w:val="98.97697766621908"/>
           <w:rFonts w:ascii="LMRoman12" w:hAnsi="LMRoman12" w:eastAsia="LMRoman12"/>
           <w:b w:val="0"/>
           <w:i w:val="0"/>
@@ -3887,7 +3989,6 @@
       </w:r>
       <w:r>
         <w:rPr>
-          <w:w w:val="98.97697766621908"/>
           <w:rFonts w:ascii="LMRoman12" w:hAnsi="LMRoman12" w:eastAsia="LMRoman12"/>
           <w:b w:val="0"/>
           <w:i w:val="0"/>
@@ -3898,7 +3999,6 @@
       </w:r>
       <w:r>
         <w:rPr>
-          <w:w w:val="98.97697766621908"/>
           <w:rFonts w:ascii="LMRoman12" w:hAnsi="LMRoman12" w:eastAsia="LMRoman12"/>
           <w:b w:val="0"/>
           <w:i w:val="0"/>
@@ -3909,7 +4009,6 @@
       </w:r>
       <w:r>
         <w:rPr>
-          <w:w w:val="98.97697766621908"/>
           <w:rFonts w:ascii="LMRoman12" w:hAnsi="LMRoman12" w:eastAsia="LMRoman12"/>
           <w:b w:val="0"/>
           <w:i w:val="0"/>
@@ -3930,7 +4029,6 @@
       </w:r>
       <w:r>
         <w:rPr>
-          <w:w w:val="98.97697766621908"/>
           <w:rFonts w:ascii="LMRoman12" w:hAnsi="LMRoman12" w:eastAsia="LMRoman12"/>
           <w:b w:val="0"/>
           <w:i w:val="0"/>
@@ -3941,7 +4039,6 @@
       </w:r>
       <w:r>
         <w:rPr>
-          <w:w w:val="98.97697766621908"/>
           <w:rFonts w:ascii="LMRoman12" w:hAnsi="LMRoman12" w:eastAsia="LMRoman12"/>
           <w:b w:val="0"/>
           <w:i w:val="0"/>
@@ -3952,7 +4049,6 @@
       </w:r>
       <w:r>
         <w:rPr>
-          <w:w w:val="98.97697766621908"/>
           <w:rFonts w:ascii="LMRoman12" w:hAnsi="LMRoman12" w:eastAsia="LMRoman12"/>
           <w:b w:val="0"/>
           <w:i w:val="0"/>
@@ -3963,7 +4059,6 @@
       </w:r>
       <w:r>
         <w:rPr>
-          <w:w w:val="98.97697766621908"/>
           <w:rFonts w:ascii="LMRoman12" w:hAnsi="LMRoman12" w:eastAsia="LMRoman12"/>
           <w:b w:val="0"/>
           <w:i w:val="0"/>
@@ -3974,7 +4069,6 @@
       </w:r>
       <w:r>
         <w:rPr>
-          <w:w w:val="98.97697766621908"/>
           <w:rFonts w:ascii="LMRoman12" w:hAnsi="LMRoman12" w:eastAsia="LMRoman12"/>
           <w:b w:val="0"/>
           <w:i w:val="0"/>
@@ -3985,44 +4079,13 @@
       </w:r>
       <w:r>
         <w:rPr>
-          <w:w w:val="98.97697766621908"/>
-          <w:rFonts w:ascii="LMRoman12" w:hAnsi="LMRoman12" w:eastAsia="LMRoman12"/>
-          <w:b w:val="0"/>
-          <w:i w:val="0"/>
-          <w:color w:val="000000"/>
-          <w:sz w:val="24"/>
-        </w:rPr>
-        <w:t xml:space="preserve">published </w:t>
-      </w:r>
-      <w:r>
-        <w:rPr>
-          <w:rFonts w:ascii="LMRoman12" w:hAnsi="LMRoman12" w:eastAsia="LMRoman12"/>
-          <w:b w:val="0"/>
-          <w:i w:val="0"/>
-          <w:color w:val="000000"/>
-          <w:sz w:val="24"/>
-        </w:rPr>
-        <w:t>in</w:t>
-      </w:r>
-      <w:r>
-        <w:rPr>
-          <w:rFonts w:ascii="LMRoman12" w:hAnsi="LMRoman12" w:eastAsia="LMRoman12"/>
-          <w:b w:val="0"/>
-          <w:i w:val="0"/>
-          <w:color w:val="000000"/>
-          <w:sz w:val="24"/>
-        </w:rPr>
-        <w:t>a</w:t>
-      </w:r>
-      <w:r>
-        <w:rPr>
-          <w:rFonts w:ascii="LMRoman12" w:hAnsi="LMRoman12" w:eastAsia="LMRoman12"/>
-          <w:b w:val="0"/>
-          <w:i w:val="0"/>
-          <w:color w:val="000000"/>
-          <w:sz w:val="24"/>
-        </w:rPr>
-        <w:t>release</w:t>
+          <w:rFonts w:ascii="LMRoman12" w:hAnsi="LMRoman12" w:eastAsia="LMRoman12"/>
+          <w:b w:val="0"/>
+          <w:i w:val="0"/>
+          <w:color w:val="000000"/>
+          <w:sz w:val="24"/>
+        </w:rPr>
+        <w:t xml:space="preserve">released </w:t>
       </w:r>
       <w:r>
         <w:rPr>
@@ -4329,11 +4392,11 @@
         <w:tblW w:type="auto" w:w="0"/>
         <w:tblLayout w:type="fixed"/>
         <w:tblLook w:firstColumn="1" w:firstRow="1" w:lastColumn="0" w:lastRow="0" w:noHBand="0" w:noVBand="1" w:val="04A0"/>
-        <w:tblInd w:w="7.9999999999998295" w:type="dxa"/>
+        <w:tblInd w:w="0.0" w:type="dxa"/>
       </w:tblPr>
       <w:tblGrid>
-        <w:gridCol w:w="4708"/>
-        <w:gridCol w:w="4708"/>
+        <w:gridCol w:w="4704"/>
+        <w:gridCol w:w="4704"/>
       </w:tblGrid>
       <w:tr>
         <w:trPr>
@@ -4441,7 +4504,7 @@
         <w:autoSpaceDE w:val="0"/>
         <w:widowControl/>
         <w:spacing w:line="298" w:lineRule="exact" w:before="466" w:after="0"/>
-        <w:ind w:left="12" w:right="0" w:firstLine="0"/>
+        <w:ind w:left="4" w:right="0" w:firstLine="0"/>
         <w:jc w:val="left"/>
       </w:pPr>
       <w:r>
@@ -4492,16 +4555,6 @@
           <w:color w:val="1E5CA0"/>
           <w:sz w:val="24"/>
         </w:rPr>
-        <w:t>1.</w:t>
-      </w:r>
-      <w:r>
-        <w:rPr>
-          <w:rFonts w:ascii="LMRoman12" w:hAnsi="LMRoman12" w:eastAsia="LMRoman12"/>
-          <w:b w:val="0"/>
-          <w:i w:val="0"/>
-          <w:color w:val="1E5CA0"/>
-          <w:sz w:val="24"/>
-        </w:rPr>
         <w:t>Introduction</w:t>
       </w:r>
       <w:r>
@@ -4512,7 +4565,7 @@
           <w:color w:val="000000"/>
           <w:sz w:val="24"/>
         </w:rPr>
-        <w:t>..................................................................................................................</w:t>
+        <w:t>......................................................................................................................</w:t>
       </w:r>
       <w:r>
         <w:rPr>
@@ -4530,7 +4583,7 @@
         <w:autoSpaceDN w:val="0"/>
         <w:autoSpaceDE w:val="0"/>
         <w:widowControl/>
-        <w:spacing w:line="246" w:lineRule="exact" w:before="158" w:after="0"/>
+        <w:spacing w:line="240" w:lineRule="exact" w:before="158" w:after="0"/>
         <w:ind w:left="0" w:right="0" w:firstLine="0"/>
         <w:jc w:val="center"/>
       </w:pPr>
@@ -4542,7 +4595,17 @@
           <w:color w:val="1E5CA0"/>
           <w:sz w:val="24"/>
         </w:rPr>
-        <w:t>2.</w:t>
+        <w:t>Documents</w:t>
+      </w:r>
+      <w:r>
+        <w:rPr>
+          <w:rFonts w:ascii="LMRoman12" w:hAnsi="LMRoman12" w:eastAsia="LMRoman12"/>
+          <w:b w:val="0"/>
+          <w:i w:val="0"/>
+          <w:color w:val="000000"/>
+          <w:sz w:val="24"/>
+        </w:rPr>
+        <w:t>........................................................................................................................</w:t>
       </w:r>
       <w:r>
         <w:rPr>
@@ -4552,37 +4615,7 @@
           <w:color w:val="1E5CA0"/>
           <w:sz w:val="24"/>
         </w:rPr>
-        <w:t>BriteTest</w:t>
-      </w:r>
-      <w:r>
-        <w:rPr>
-          <w:rFonts w:ascii="LMRoman12" w:hAnsi="LMRoman12" w:eastAsia="LMRoman12"/>
-          <w:b w:val="0"/>
-          <w:i w:val="0"/>
-          <w:color w:val="1E5CA0"/>
-          <w:sz w:val="24"/>
-        </w:rPr>
-        <w:t>Documents</w:t>
-      </w:r>
-      <w:r>
-        <w:rPr>
-          <w:rFonts w:ascii="LMRoman12" w:hAnsi="LMRoman12" w:eastAsia="LMRoman12"/>
-          <w:b w:val="0"/>
-          <w:i w:val="0"/>
-          <w:color w:val="000000"/>
-          <w:sz w:val="24"/>
-        </w:rPr>
-        <w:t>..................................................................................................</w:t>
-      </w:r>
-      <w:r>
-        <w:rPr>
-          <w:rFonts w:ascii="LMRoman12" w:hAnsi="LMRoman12" w:eastAsia="LMRoman12"/>
-          <w:b/>
-          <w:i w:val="0"/>
-          <w:color w:val="1E5CA0"/>
-          <w:sz w:val="24"/>
-        </w:rPr>
-        <w:t>??</w:t>
+        <w:t>2</w:t>
       </w:r>
     </w:p>
     <w:p>
@@ -4590,7 +4623,7 @@
         <w:autoSpaceDN w:val="0"/>
         <w:autoSpaceDE w:val="0"/>
         <w:widowControl/>
-        <w:spacing w:line="244" w:lineRule="exact" w:before="154" w:after="11822"/>
+        <w:spacing w:line="238" w:lineRule="exact" w:before="160" w:after="11828"/>
         <w:ind w:left="0" w:right="0" w:firstLine="0"/>
         <w:jc w:val="center"/>
       </w:pPr>
@@ -4602,7 +4635,7 @@
           <w:color w:val="1E5CA0"/>
           <w:sz w:val="24"/>
         </w:rPr>
-        <w:t>3.</w:t>
+        <w:t>Repository</w:t>
       </w:r>
       <w:r>
         <w:rPr>
@@ -4612,7 +4645,17 @@
           <w:color w:val="1E5CA0"/>
           <w:sz w:val="24"/>
         </w:rPr>
-        <w:t>BriteTest</w:t>
+        <w:t>Layout</w:t>
+      </w:r>
+      <w:r>
+        <w:rPr>
+          <w:rFonts w:ascii="LMRoman12" w:hAnsi="LMRoman12" w:eastAsia="LMRoman12"/>
+          <w:b w:val="0"/>
+          <w:i w:val="0"/>
+          <w:color w:val="000000"/>
+          <w:sz w:val="24"/>
+        </w:rPr>
+        <w:t>............................................................................................................</w:t>
       </w:r>
       <w:r>
         <w:rPr>
@@ -4622,37 +4665,7 @@
           <w:color w:val="1E5CA0"/>
           <w:sz w:val="24"/>
         </w:rPr>
-        <w:t>Repository</w:t>
-      </w:r>
-      <w:r>
-        <w:rPr>
-          <w:rFonts w:ascii="LMRoman12" w:hAnsi="LMRoman12" w:eastAsia="LMRoman12"/>
-          <w:b w:val="0"/>
-          <w:i w:val="0"/>
-          <w:color w:val="1E5CA0"/>
-          <w:sz w:val="24"/>
-        </w:rPr>
-        <w:t>Layout</w:t>
-      </w:r>
-      <w:r>
-        <w:rPr>
-          <w:rFonts w:ascii="LMRoman12" w:hAnsi="LMRoman12" w:eastAsia="LMRoman12"/>
-          <w:b w:val="0"/>
-          <w:i w:val="0"/>
-          <w:color w:val="000000"/>
-          <w:sz w:val="24"/>
-        </w:rPr>
-        <w:t>......................................................................................</w:t>
-      </w:r>
-      <w:r>
-        <w:rPr>
-          <w:rFonts w:ascii="LMRoman12" w:hAnsi="LMRoman12" w:eastAsia="LMRoman12"/>
-          <w:b/>
-          <w:i w:val="0"/>
-          <w:color w:val="1E5CA0"/>
-          <w:sz w:val="24"/>
-        </w:rPr>
-        <w:t>??</w:t>
+        <w:t>3</w:t>
       </w:r>
     </w:p>
     <w:tbl>
@@ -4660,11 +4673,11 @@
         <w:tblW w:type="auto" w:w="0"/>
         <w:tblLayout w:type="fixed"/>
         <w:tblLook w:firstColumn="1" w:firstRow="1" w:lastColumn="0" w:lastRow="0" w:noHBand="0" w:noVBand="1" w:val="04A0"/>
-        <w:tblInd w:w="7.9999999999998295" w:type="dxa"/>
+        <w:tblInd w:w="0.0" w:type="dxa"/>
       </w:tblPr>
       <w:tblGrid>
-        <w:gridCol w:w="4708"/>
-        <w:gridCol w:w="4708"/>
+        <w:gridCol w:w="4704"/>
+        <w:gridCol w:w="4704"/>
       </w:tblGrid>
       <w:tr>
         <w:trPr>
@@ -4789,7 +4802,7 @@
       <w:pPr>
         <w:sectPr>
           <w:pgSz w:w="12240" w:h="15840"/>
-          <w:pgMar w:top="358" w:right="1396" w:bottom="400" w:left="1428" w:header="720" w:footer="720" w:gutter="0"/>
+          <w:pgMar w:top="358" w:right="1396" w:bottom="400" w:left="1436" w:header="720" w:footer="720" w:gutter="0"/>
           <w:cols/>
           <w:docGrid w:linePitch="360"/>
         </w:sectPr>
@@ -8340,8 +8353,8 @@
         <w:autoSpaceDN w:val="0"/>
         <w:autoSpaceDE w:val="0"/>
         <w:widowControl/>
-        <w:spacing w:line="278" w:lineRule="exact" w:before="138" w:after="0"/>
-        <w:ind w:left="8" w:right="0" w:hanging="8"/>
+        <w:spacing w:line="240" w:lineRule="exact" w:before="176" w:after="0"/>
+        <w:ind w:left="0" w:right="0" w:firstLine="0"/>
         <w:jc w:val="left"/>
       </w:pPr>
       <w:r>
@@ -8436,23 +8449,13 @@
       </w:r>
       <w:r>
         <w:rPr>
-          <w:rFonts w:ascii="LMMono12" w:hAnsi="LMMono12" w:eastAsia="LMMono12"/>
-          <w:b w:val="0"/>
-          <w:i w:val="0"/>
-          <w:color w:val="000000"/>
-          <w:sz w:val="24"/>
-        </w:rPr>
-        <w:t>paulsinclair51/BriteTest</w:t>
-      </w:r>
-      <w:r>
-        <w:rPr>
-          <w:rFonts w:ascii="LMRoman12" w:hAnsi="LMRoman12" w:eastAsia="LMRoman12"/>
-          <w:b w:val="0"/>
-          <w:i w:val="0"/>
-          <w:color w:val="000000"/>
-          <w:sz w:val="24"/>
-        </w:rPr>
-        <w:t xml:space="preserve">(core </w:t>
+          <w:rFonts w:ascii="LMRoman12" w:hAnsi="LMRoman12" w:eastAsia="LMRoman12"/>
+          <w:b w:val="0"/>
+          <w:i w:val="0"/>
+          <w:color w:val="000000"/>
+          <w:sz w:val="24"/>
+        </w:rPr>
+        <w:t>(core</w:t>
       </w:r>
       <w:r>
         <w:rPr>
@@ -8493,7 +8496,7 @@
         </w:tabs>
         <w:autoSpaceDE w:val="0"/>
         <w:widowControl/>
-        <w:spacing w:line="278" w:lineRule="exact" w:before="122" w:after="0"/>
+        <w:spacing w:line="280" w:lineRule="exact" w:before="120" w:after="0"/>
         <w:ind w:left="8" w:right="1728" w:firstLine="0"/>
         <w:jc w:val="left"/>
       </w:pPr>
@@ -8647,6 +8650,363 @@
           <w:sz w:val="24"/>
         </w:rPr>
         <w:t>artifacts.</w:t>
+      </w:r>
+    </w:p>
+    <w:p>
+      <w:pPr>
+        <w:autoSpaceDN w:val="0"/>
+        <w:tabs>
+          <w:tab w:pos="2962" w:val="left"/>
+        </w:tabs>
+        <w:autoSpaceDE w:val="0"/>
+        <w:widowControl/>
+        <w:spacing w:line="238" w:lineRule="exact" w:before="40" w:after="0"/>
+        <w:ind w:left="8" w:right="0" w:firstLine="0"/>
+        <w:jc w:val="left"/>
+      </w:pPr>
+      <w:r>
+        <w:rPr>
+          <w:rFonts w:ascii="LMMono12" w:hAnsi="LMMono12" w:eastAsia="LMMono12"/>
+          <w:b w:val="0"/>
+          <w:i w:val="0"/>
+          <w:color w:val="000000"/>
+          <w:sz w:val="24"/>
+        </w:rPr>
+        <w:t xml:space="preserve">config/ </w:t>
+      </w:r>
+      <w:r>
+        <w:tab/>
+      </w:r>
+      <w:r>
+        <w:rPr>
+          <w:rFonts w:ascii="LMMono12" w:hAnsi="LMMono12" w:eastAsia="LMMono12"/>
+          <w:b w:val="0"/>
+          <w:i w:val="0"/>
+          <w:color w:val="000000"/>
+          <w:sz w:val="24"/>
+        </w:rPr>
+        <w:t>#</w:t>
+      </w:r>
+      <w:r>
+        <w:rPr>
+          <w:rFonts w:ascii="LMMono12" w:hAnsi="LMMono12" w:eastAsia="LMMono12"/>
+          <w:b w:val="0"/>
+          <w:i w:val="0"/>
+          <w:color w:val="000000"/>
+          <w:sz w:val="24"/>
+        </w:rPr>
+        <w:t>Repository</w:t>
+      </w:r>
+      <w:r>
+        <w:rPr>
+          <w:rFonts w:ascii="LMMono12" w:hAnsi="LMMono12" w:eastAsia="LMMono12"/>
+          <w:b w:val="0"/>
+          <w:i w:val="0"/>
+          <w:color w:val="000000"/>
+          <w:sz w:val="24"/>
+        </w:rPr>
+        <w:t>configuration</w:t>
+      </w:r>
+      <w:r>
+        <w:rPr>
+          <w:rFonts w:ascii="LMMono12" w:hAnsi="LMMono12" w:eastAsia="LMMono12"/>
+          <w:b w:val="0"/>
+          <w:i w:val="0"/>
+          <w:color w:val="000000"/>
+          <w:sz w:val="24"/>
+        </w:rPr>
+        <w:t>files.</w:t>
+      </w:r>
+    </w:p>
+    <w:p>
+      <w:pPr>
+        <w:autoSpaceDN w:val="0"/>
+        <w:tabs>
+          <w:tab w:pos="500" w:val="left"/>
+          <w:tab w:pos="2962" w:val="left"/>
+        </w:tabs>
+        <w:autoSpaceDE w:val="0"/>
+        <w:widowControl/>
+        <w:spacing w:line="278" w:lineRule="exact" w:before="2" w:after="0"/>
+        <w:ind w:left="8" w:right="1872" w:firstLine="0"/>
+        <w:jc w:val="left"/>
+      </w:pPr>
+      <w:r>
+        <w:rPr>
+          <w:rFonts w:ascii="LMMono12" w:hAnsi="LMMono12" w:eastAsia="LMMono12"/>
+          <w:b w:val="0"/>
+          <w:i w:val="0"/>
+          <w:color w:val="000000"/>
+          <w:sz w:val="24"/>
+        </w:rPr>
+        <w:t xml:space="preserve">markdownlint.json </w:t>
+      </w:r>
+      <w:r>
+        <w:br/>
+      </w:r>
+      <w:r>
+        <w:rPr>
+          <w:rFonts w:ascii="LMMono12" w:hAnsi="LMMono12" w:eastAsia="LMMono12"/>
+          <w:b w:val="0"/>
+          <w:i w:val="0"/>
+          <w:color w:val="000000"/>
+          <w:sz w:val="24"/>
+        </w:rPr>
+        <w:t xml:space="preserve">docs/ </w:t>
+      </w:r>
+      <w:r>
+        <w:tab/>
+      </w:r>
+      <w:r>
+        <w:rPr>
+          <w:rFonts w:ascii="LMMono12" w:hAnsi="LMMono12" w:eastAsia="LMMono12"/>
+          <w:b w:val="0"/>
+          <w:i w:val="0"/>
+          <w:color w:val="000000"/>
+          <w:sz w:val="24"/>
+        </w:rPr>
+        <w:t>#</w:t>
+      </w:r>
+      <w:r>
+        <w:rPr>
+          <w:rFonts w:ascii="LMMono12" w:hAnsi="LMMono12" w:eastAsia="LMMono12"/>
+          <w:b w:val="0"/>
+          <w:i w:val="0"/>
+          <w:color w:val="000000"/>
+          <w:sz w:val="24"/>
+        </w:rPr>
+        <w:t>User</w:t>
+      </w:r>
+      <w:r>
+        <w:rPr>
+          <w:rFonts w:ascii="LMMono12" w:hAnsi="LMMono12" w:eastAsia="LMMono12"/>
+          <w:b w:val="0"/>
+          <w:i w:val="0"/>
+          <w:color w:val="000000"/>
+          <w:sz w:val="24"/>
+        </w:rPr>
+        <w:t>and</w:t>
+      </w:r>
+      <w:r>
+        <w:rPr>
+          <w:rFonts w:ascii="LMMono12" w:hAnsi="LMMono12" w:eastAsia="LMMono12"/>
+          <w:b w:val="0"/>
+          <w:i w:val="0"/>
+          <w:color w:val="000000"/>
+          <w:sz w:val="24"/>
+        </w:rPr>
+        <w:t>contributor</w:t>
+      </w:r>
+      <w:r>
+        <w:rPr>
+          <w:rFonts w:ascii="LMMono12" w:hAnsi="LMMono12" w:eastAsia="LMMono12"/>
+          <w:b w:val="0"/>
+          <w:i w:val="0"/>
+          <w:color w:val="000000"/>
+          <w:sz w:val="24"/>
+        </w:rPr>
+        <w:t>documentation.</w:t>
+      </w:r>
+    </w:p>
+    <w:p>
+      <w:pPr>
+        <w:autoSpaceDN w:val="0"/>
+        <w:tabs>
+          <w:tab w:pos="2962" w:val="left"/>
+        </w:tabs>
+        <w:autoSpaceDE w:val="0"/>
+        <w:widowControl/>
+        <w:spacing w:line="278" w:lineRule="exact" w:before="2" w:after="0"/>
+        <w:ind w:left="500" w:right="3168" w:firstLine="0"/>
+        <w:jc w:val="left"/>
+      </w:pPr>
+      <w:r>
+        <w:rPr>
+          <w:rFonts w:ascii="LMMono12" w:hAnsi="LMMono12" w:eastAsia="LMMono12"/>
+          <w:b w:val="0"/>
+          <w:i w:val="0"/>
+          <w:color w:val="000000"/>
+          <w:sz w:val="24"/>
+        </w:rPr>
+        <w:t xml:space="preserve">*.md </w:t>
+      </w:r>
+      <w:r>
+        <w:br/>
+      </w:r>
+      <w:r>
+        <w:rPr>
+          <w:rFonts w:ascii="LMMono12" w:hAnsi="LMMono12" w:eastAsia="LMMono12"/>
+          <w:b w:val="0"/>
+          <w:i w:val="0"/>
+          <w:color w:val="000000"/>
+          <w:sz w:val="24"/>
+        </w:rPr>
+        <w:t xml:space="preserve">pdf/ </w:t>
+      </w:r>
+      <w:r>
+        <w:tab/>
+      </w:r>
+      <w:r>
+        <w:rPr>
+          <w:rFonts w:ascii="LMMono12" w:hAnsi="LMMono12" w:eastAsia="LMMono12"/>
+          <w:b w:val="0"/>
+          <w:i w:val="0"/>
+          <w:color w:val="000000"/>
+          <w:sz w:val="24"/>
+        </w:rPr>
+        <w:t>#</w:t>
+      </w:r>
+      <w:r>
+        <w:rPr>
+          <w:rFonts w:ascii="LMMono12" w:hAnsi="LMMono12" w:eastAsia="LMMono12"/>
+          <w:b w:val="0"/>
+          <w:i w:val="0"/>
+          <w:color w:val="000000"/>
+          <w:sz w:val="24"/>
+        </w:rPr>
+        <w:t>Generated</w:t>
+      </w:r>
+      <w:r>
+        <w:rPr>
+          <w:rFonts w:ascii="LMMono12" w:hAnsi="LMMono12" w:eastAsia="LMMono12"/>
+          <w:b w:val="0"/>
+          <w:i w:val="0"/>
+          <w:color w:val="000000"/>
+          <w:sz w:val="24"/>
+        </w:rPr>
+        <w:t>`*.pdf`</w:t>
+      </w:r>
+      <w:r>
+        <w:rPr>
+          <w:rFonts w:ascii="LMMono12" w:hAnsi="LMMono12" w:eastAsia="LMMono12"/>
+          <w:b w:val="0"/>
+          <w:i w:val="0"/>
+          <w:color w:val="000000"/>
+          <w:sz w:val="24"/>
+        </w:rPr>
+        <w:t>files.</w:t>
+      </w:r>
+    </w:p>
+    <w:p>
+      <w:pPr>
+        <w:autoSpaceDN w:val="0"/>
+        <w:tabs>
+          <w:tab w:pos="2962" w:val="left"/>
+        </w:tabs>
+        <w:autoSpaceDE w:val="0"/>
+        <w:widowControl/>
+        <w:spacing w:line="240" w:lineRule="exact" w:before="40" w:after="0"/>
+        <w:ind w:left="500" w:right="0" w:firstLine="0"/>
+        <w:jc w:val="left"/>
+      </w:pPr>
+      <w:r>
+        <w:rPr>
+          <w:rFonts w:ascii="LMMono12" w:hAnsi="LMMono12" w:eastAsia="LMMono12"/>
+          <w:b w:val="0"/>
+          <w:i w:val="0"/>
+          <w:color w:val="000000"/>
+          <w:sz w:val="24"/>
+        </w:rPr>
+        <w:t xml:space="preserve">docx/ </w:t>
+      </w:r>
+      <w:r>
+        <w:tab/>
+      </w:r>
+      <w:r>
+        <w:rPr>
+          <w:rFonts w:ascii="LMMono12" w:hAnsi="LMMono12" w:eastAsia="LMMono12"/>
+          <w:b w:val="0"/>
+          <w:i w:val="0"/>
+          <w:color w:val="000000"/>
+          <w:sz w:val="24"/>
+        </w:rPr>
+        <w:t>#</w:t>
+      </w:r>
+      <w:r>
+        <w:rPr>
+          <w:rFonts w:ascii="LMMono12" w:hAnsi="LMMono12" w:eastAsia="LMMono12"/>
+          <w:b w:val="0"/>
+          <w:i w:val="0"/>
+          <w:color w:val="000000"/>
+          <w:sz w:val="24"/>
+        </w:rPr>
+        <w:t>Generated</w:t>
+      </w:r>
+      <w:r>
+        <w:rPr>
+          <w:rFonts w:ascii="LMMono12" w:hAnsi="LMMono12" w:eastAsia="LMMono12"/>
+          <w:b w:val="0"/>
+          <w:i w:val="0"/>
+          <w:color w:val="000000"/>
+          <w:sz w:val="24"/>
+        </w:rPr>
+        <w:t>`*.docx`</w:t>
+      </w:r>
+      <w:r>
+        <w:rPr>
+          <w:rFonts w:ascii="LMMono12" w:hAnsi="LMMono12" w:eastAsia="LMMono12"/>
+          <w:b w:val="0"/>
+          <w:i w:val="0"/>
+          <w:color w:val="000000"/>
+          <w:sz w:val="24"/>
+        </w:rPr>
+        <w:t>files.</w:t>
+      </w:r>
+    </w:p>
+    <w:p>
+      <w:pPr>
+        <w:autoSpaceDN w:val="0"/>
+        <w:tabs>
+          <w:tab w:pos="2962" w:val="left"/>
+        </w:tabs>
+        <w:autoSpaceDE w:val="0"/>
+        <w:widowControl/>
+        <w:spacing w:line="238" w:lineRule="exact" w:before="40" w:after="0"/>
+        <w:ind w:left="8" w:right="0" w:firstLine="0"/>
+        <w:jc w:val="left"/>
+      </w:pPr>
+      <w:r>
+        <w:rPr>
+          <w:rFonts w:ascii="LMMono12" w:hAnsi="LMMono12" w:eastAsia="LMMono12"/>
+          <w:b w:val="0"/>
+          <w:i w:val="0"/>
+          <w:color w:val="000000"/>
+          <w:sz w:val="24"/>
+        </w:rPr>
+        <w:t xml:space="preserve">examples/ </w:t>
+      </w:r>
+      <w:r>
+        <w:tab/>
+      </w:r>
+      <w:r>
+        <w:rPr>
+          <w:rFonts w:ascii="LMMono12" w:hAnsi="LMMono12" w:eastAsia="LMMono12"/>
+          <w:b w:val="0"/>
+          <w:i w:val="0"/>
+          <w:color w:val="000000"/>
+          <w:sz w:val="24"/>
+        </w:rPr>
+        <w:t>#</w:t>
+      </w:r>
+      <w:r>
+        <w:rPr>
+          <w:rFonts w:ascii="LMMono12" w:hAnsi="LMMono12" w:eastAsia="LMMono12"/>
+          <w:b w:val="0"/>
+          <w:i w:val="0"/>
+          <w:color w:val="000000"/>
+          <w:sz w:val="24"/>
+        </w:rPr>
+        <w:t>Usage</w:t>
+      </w:r>
+      <w:r>
+        <w:rPr>
+          <w:rFonts w:ascii="LMMono12" w:hAnsi="LMMono12" w:eastAsia="LMMono12"/>
+          <w:b w:val="0"/>
+          <w:i w:val="0"/>
+          <w:color w:val="000000"/>
+          <w:sz w:val="24"/>
+        </w:rPr>
+        <w:t>examples.</w:t>
       </w:r>
     </w:p>
     <w:p>
@@ -8669,7 +9029,7 @@
           <w:color w:val="000000"/>
           <w:sz w:val="24"/>
         </w:rPr>
-        <w:t xml:space="preserve">config/ </w:t>
+        <w:t xml:space="preserve">include/ </w:t>
       </w:r>
       <w:r>
         <w:tab/>
@@ -8692,7 +9052,7 @@
           <w:color w:val="000000"/>
           <w:sz w:val="24"/>
         </w:rPr>
-        <w:t>Repository</w:t>
+        <w:t>Public</w:t>
       </w:r>
       <w:r>
         <w:rPr>
@@ -8702,7 +9062,7 @@
           <w:color w:val="000000"/>
           <w:sz w:val="24"/>
         </w:rPr>
-        <w:t>configuration</w:t>
+        <w:t>API</w:t>
       </w:r>
       <w:r>
         <w:rPr>
@@ -8712,7 +9072,17 @@
           <w:color w:val="000000"/>
           <w:sz w:val="24"/>
         </w:rPr>
-        <w:t>files.</w:t>
+        <w:t>`.h`</w:t>
+      </w:r>
+      <w:r>
+        <w:rPr>
+          <w:rFonts w:ascii="LMMono12" w:hAnsi="LMMono12" w:eastAsia="LMMono12"/>
+          <w:b w:val="0"/>
+          <w:i w:val="0"/>
+          <w:color w:val="000000"/>
+          <w:sz w:val="24"/>
+        </w:rPr>
+        <w:t>headers.</w:t>
       </w:r>
     </w:p>
     <w:p>
@@ -8725,7 +9095,7 @@
         <w:autoSpaceDE w:val="0"/>
         <w:widowControl/>
         <w:spacing w:line="278" w:lineRule="exact" w:before="0" w:after="0"/>
-        <w:ind w:left="8" w:right="1872" w:firstLine="0"/>
+        <w:ind w:left="8" w:right="3312" w:firstLine="0"/>
         <w:jc w:val="left"/>
       </w:pPr>
       <w:r>
@@ -8736,7 +9106,7 @@
           <w:color w:val="000000"/>
           <w:sz w:val="24"/>
         </w:rPr>
-        <w:t xml:space="preserve">markdownlint.json </w:t>
+        <w:t xml:space="preserve">runnerapi.h </w:t>
       </w:r>
       <w:r>
         <w:br/>
@@ -8749,7 +9119,20 @@
           <w:color w:val="000000"/>
           <w:sz w:val="24"/>
         </w:rPr>
-        <w:t xml:space="preserve">docs/ </w:t>
+        <w:t xml:space="preserve">testapi.h </w:t>
+      </w:r>
+      <w:r>
+        <w:br/>
+      </w:r>
+      <w:r>
+        <w:rPr>
+          <w:rFonts w:ascii="LMMono12" w:hAnsi="LMMono12" w:eastAsia="LMMono12"/>
+          <w:b w:val="0"/>
+          <w:i w:val="0"/>
+          <w:color w:val="000000"/>
+          <w:sz w:val="24"/>
+        </w:rPr>
+        <w:t xml:space="preserve">reports/ </w:t>
       </w:r>
       <w:r>
         <w:tab/>
@@ -8772,7 +9155,7 @@
           <w:color w:val="000000"/>
           <w:sz w:val="24"/>
         </w:rPr>
-        <w:t>User</w:t>
+        <w:t>Generated</w:t>
       </w:r>
       <w:r>
         <w:rPr>
@@ -8782,162 +9165,7 @@
           <w:color w:val="000000"/>
           <w:sz w:val="24"/>
         </w:rPr>
-        <w:t>and</w:t>
-      </w:r>
-      <w:r>
-        <w:rPr>
-          <w:rFonts w:ascii="LMMono12" w:hAnsi="LMMono12" w:eastAsia="LMMono12"/>
-          <w:b w:val="0"/>
-          <w:i w:val="0"/>
-          <w:color w:val="000000"/>
-          <w:sz w:val="24"/>
-        </w:rPr>
-        <w:t>contributor</w:t>
-      </w:r>
-      <w:r>
-        <w:rPr>
-          <w:rFonts w:ascii="LMMono12" w:hAnsi="LMMono12" w:eastAsia="LMMono12"/>
-          <w:b w:val="0"/>
-          <w:i w:val="0"/>
-          <w:color w:val="000000"/>
-          <w:sz w:val="24"/>
-        </w:rPr>
-        <w:t>documentation.</w:t>
-      </w:r>
-    </w:p>
-    <w:p>
-      <w:pPr>
-        <w:autoSpaceDN w:val="0"/>
-        <w:tabs>
-          <w:tab w:pos="2962" w:val="left"/>
-        </w:tabs>
-        <w:autoSpaceDE w:val="0"/>
-        <w:widowControl/>
-        <w:spacing w:line="280" w:lineRule="exact" w:before="0" w:after="0"/>
-        <w:ind w:left="500" w:right="3168" w:firstLine="0"/>
-        <w:jc w:val="left"/>
-      </w:pPr>
-      <w:r>
-        <w:rPr>
-          <w:rFonts w:ascii="LMMono12" w:hAnsi="LMMono12" w:eastAsia="LMMono12"/>
-          <w:b w:val="0"/>
-          <w:i w:val="0"/>
-          <w:color w:val="000000"/>
-          <w:sz w:val="24"/>
-        </w:rPr>
-        <w:t xml:space="preserve">*.md </w:t>
-      </w:r>
-      <w:r>
-        <w:br/>
-      </w:r>
-      <w:r>
-        <w:rPr>
-          <w:rFonts w:ascii="LMMono12" w:hAnsi="LMMono12" w:eastAsia="LMMono12"/>
-          <w:b w:val="0"/>
-          <w:i w:val="0"/>
-          <w:color w:val="000000"/>
-          <w:sz w:val="24"/>
-        </w:rPr>
-        <w:t xml:space="preserve">pdf/ </w:t>
-      </w:r>
-      <w:r>
-        <w:tab/>
-      </w:r>
-      <w:r>
-        <w:rPr>
-          <w:rFonts w:ascii="LMMono12" w:hAnsi="LMMono12" w:eastAsia="LMMono12"/>
-          <w:b w:val="0"/>
-          <w:i w:val="0"/>
-          <w:color w:val="000000"/>
-          <w:sz w:val="24"/>
-        </w:rPr>
-        <w:t>#</w:t>
-      </w:r>
-      <w:r>
-        <w:rPr>
-          <w:rFonts w:ascii="LMMono12" w:hAnsi="LMMono12" w:eastAsia="LMMono12"/>
-          <w:b w:val="0"/>
-          <w:i w:val="0"/>
-          <w:color w:val="000000"/>
-          <w:sz w:val="24"/>
-        </w:rPr>
-        <w:t>Generated</w:t>
-      </w:r>
-      <w:r>
-        <w:rPr>
-          <w:rFonts w:ascii="LMMono12" w:hAnsi="LMMono12" w:eastAsia="LMMono12"/>
-          <w:b w:val="0"/>
-          <w:i w:val="0"/>
-          <w:color w:val="000000"/>
-          <w:sz w:val="24"/>
-        </w:rPr>
-        <w:t>`*.pdf`</w:t>
-      </w:r>
-      <w:r>
-        <w:rPr>
-          <w:rFonts w:ascii="LMMono12" w:hAnsi="LMMono12" w:eastAsia="LMMono12"/>
-          <w:b w:val="0"/>
-          <w:i w:val="0"/>
-          <w:color w:val="000000"/>
-          <w:sz w:val="24"/>
-        </w:rPr>
-        <w:t>files.</w:t>
-      </w:r>
-    </w:p>
-    <w:p>
-      <w:pPr>
-        <w:autoSpaceDN w:val="0"/>
-        <w:tabs>
-          <w:tab w:pos="2962" w:val="left"/>
-        </w:tabs>
-        <w:autoSpaceDE w:val="0"/>
-        <w:widowControl/>
-        <w:spacing w:line="238" w:lineRule="exact" w:before="40" w:after="0"/>
-        <w:ind w:left="500" w:right="0" w:firstLine="0"/>
-        <w:jc w:val="left"/>
-      </w:pPr>
-      <w:r>
-        <w:rPr>
-          <w:rFonts w:ascii="LMMono12" w:hAnsi="LMMono12" w:eastAsia="LMMono12"/>
-          <w:b w:val="0"/>
-          <w:i w:val="0"/>
-          <w:color w:val="000000"/>
-          <w:sz w:val="24"/>
-        </w:rPr>
-        <w:t xml:space="preserve">docx/ </w:t>
-      </w:r>
-      <w:r>
-        <w:tab/>
-      </w:r>
-      <w:r>
-        <w:rPr>
-          <w:rFonts w:ascii="LMMono12" w:hAnsi="LMMono12" w:eastAsia="LMMono12"/>
-          <w:b w:val="0"/>
-          <w:i w:val="0"/>
-          <w:color w:val="000000"/>
-          <w:sz w:val="24"/>
-        </w:rPr>
-        <w:t>#</w:t>
-      </w:r>
-      <w:r>
-        <w:rPr>
-          <w:rFonts w:ascii="LMMono12" w:hAnsi="LMMono12" w:eastAsia="LMMono12"/>
-          <w:b w:val="0"/>
-          <w:i w:val="0"/>
-          <w:color w:val="000000"/>
-          <w:sz w:val="24"/>
-        </w:rPr>
-        <w:t>Generated</w:t>
-      </w:r>
-      <w:r>
-        <w:rPr>
-          <w:rFonts w:ascii="LMMono12" w:hAnsi="LMMono12" w:eastAsia="LMMono12"/>
-          <w:b w:val="0"/>
-          <w:i w:val="0"/>
-          <w:color w:val="000000"/>
-          <w:sz w:val="24"/>
-        </w:rPr>
-        <w:t>`*.docx`</w:t>
+        <w:t>report</w:t>
       </w:r>
       <w:r>
         <w:rPr>
@@ -8970,7 +9198,7 @@
           <w:color w:val="000000"/>
           <w:sz w:val="24"/>
         </w:rPr>
-        <w:t xml:space="preserve">examples/ </w:t>
+        <w:t xml:space="preserve">scripts/ </w:t>
       </w:r>
       <w:r>
         <w:tab/>
@@ -8993,7 +9221,7 @@
           <w:color w:val="000000"/>
           <w:sz w:val="24"/>
         </w:rPr>
-        <w:t>Usage</w:t>
+        <w:t>Automation</w:t>
       </w:r>
       <w:r>
         <w:rPr>
@@ -9003,83 +9231,7 @@
           <w:color w:val="000000"/>
           <w:sz w:val="24"/>
         </w:rPr>
-        <w:t>examples.</w:t>
-      </w:r>
-    </w:p>
-    <w:p>
-      <w:pPr>
-        <w:autoSpaceDN w:val="0"/>
-        <w:tabs>
-          <w:tab w:pos="2962" w:val="left"/>
-        </w:tabs>
-        <w:autoSpaceDE w:val="0"/>
-        <w:widowControl/>
-        <w:spacing w:line="238" w:lineRule="exact" w:before="40" w:after="0"/>
-        <w:ind w:left="8" w:right="0" w:firstLine="0"/>
-        <w:jc w:val="left"/>
-      </w:pPr>
-      <w:r>
-        <w:rPr>
-          <w:rFonts w:ascii="LMMono12" w:hAnsi="LMMono12" w:eastAsia="LMMono12"/>
-          <w:b w:val="0"/>
-          <w:i w:val="0"/>
-          <w:color w:val="000000"/>
-          <w:sz w:val="24"/>
-        </w:rPr>
-        <w:t xml:space="preserve">include/ </w:t>
-      </w:r>
-      <w:r>
-        <w:tab/>
-      </w:r>
-      <w:r>
-        <w:rPr>
-          <w:rFonts w:ascii="LMMono12" w:hAnsi="LMMono12" w:eastAsia="LMMono12"/>
-          <w:b w:val="0"/>
-          <w:i w:val="0"/>
-          <w:color w:val="000000"/>
-          <w:sz w:val="24"/>
-        </w:rPr>
-        <w:t>#</w:t>
-      </w:r>
-      <w:r>
-        <w:rPr>
-          <w:rFonts w:ascii="LMMono12" w:hAnsi="LMMono12" w:eastAsia="LMMono12"/>
-          <w:b w:val="0"/>
-          <w:i w:val="0"/>
-          <w:color w:val="000000"/>
-          <w:sz w:val="24"/>
-        </w:rPr>
-        <w:t>Public</w:t>
-      </w:r>
-      <w:r>
-        <w:rPr>
-          <w:rFonts w:ascii="LMMono12" w:hAnsi="LMMono12" w:eastAsia="LMMono12"/>
-          <w:b w:val="0"/>
-          <w:i w:val="0"/>
-          <w:color w:val="000000"/>
-          <w:sz w:val="24"/>
-        </w:rPr>
-        <w:t>API</w:t>
-      </w:r>
-      <w:r>
-        <w:rPr>
-          <w:rFonts w:ascii="LMMono12" w:hAnsi="LMMono12" w:eastAsia="LMMono12"/>
-          <w:b w:val="0"/>
-          <w:i w:val="0"/>
-          <w:color w:val="000000"/>
-          <w:sz w:val="24"/>
-        </w:rPr>
-        <w:t>`.h`</w:t>
-      </w:r>
-      <w:r>
-        <w:rPr>
-          <w:rFonts w:ascii="LMMono12" w:hAnsi="LMMono12" w:eastAsia="LMMono12"/>
-          <w:b w:val="0"/>
-          <w:i w:val="0"/>
-          <w:color w:val="000000"/>
-          <w:sz w:val="24"/>
-        </w:rPr>
-        <w:t>headers.</w:t>
+        <w:t>scripts.</w:t>
       </w:r>
     </w:p>
     <w:p>
@@ -9092,155 +9244,6 @@
         <w:autoSpaceDE w:val="0"/>
         <w:widowControl/>
         <w:spacing w:line="280" w:lineRule="exact" w:before="0" w:after="0"/>
-        <w:ind w:left="8" w:right="3312" w:firstLine="0"/>
-        <w:jc w:val="left"/>
-      </w:pPr>
-      <w:r>
-        <w:rPr>
-          <w:rFonts w:ascii="LMMono12" w:hAnsi="LMMono12" w:eastAsia="LMMono12"/>
-          <w:b w:val="0"/>
-          <w:i w:val="0"/>
-          <w:color w:val="000000"/>
-          <w:sz w:val="24"/>
-        </w:rPr>
-        <w:t xml:space="preserve">runnerapi.h </w:t>
-      </w:r>
-      <w:r>
-        <w:br/>
-      </w:r>
-      <w:r>
-        <w:rPr>
-          <w:rFonts w:ascii="LMMono12" w:hAnsi="LMMono12" w:eastAsia="LMMono12"/>
-          <w:b w:val="0"/>
-          <w:i w:val="0"/>
-          <w:color w:val="000000"/>
-          <w:sz w:val="24"/>
-        </w:rPr>
-        <w:t xml:space="preserve">testapi.h </w:t>
-      </w:r>
-      <w:r>
-        <w:br/>
-      </w:r>
-      <w:r>
-        <w:rPr>
-          <w:rFonts w:ascii="LMMono12" w:hAnsi="LMMono12" w:eastAsia="LMMono12"/>
-          <w:b w:val="0"/>
-          <w:i w:val="0"/>
-          <w:color w:val="000000"/>
-          <w:sz w:val="24"/>
-        </w:rPr>
-        <w:t xml:space="preserve">reports/ </w:t>
-      </w:r>
-      <w:r>
-        <w:tab/>
-      </w:r>
-      <w:r>
-        <w:rPr>
-          <w:rFonts w:ascii="LMMono12" w:hAnsi="LMMono12" w:eastAsia="LMMono12"/>
-          <w:b w:val="0"/>
-          <w:i w:val="0"/>
-          <w:color w:val="000000"/>
-          <w:sz w:val="24"/>
-        </w:rPr>
-        <w:t>#</w:t>
-      </w:r>
-      <w:r>
-        <w:rPr>
-          <w:rFonts w:ascii="LMMono12" w:hAnsi="LMMono12" w:eastAsia="LMMono12"/>
-          <w:b w:val="0"/>
-          <w:i w:val="0"/>
-          <w:color w:val="000000"/>
-          <w:sz w:val="24"/>
-        </w:rPr>
-        <w:t>Generated</w:t>
-      </w:r>
-      <w:r>
-        <w:rPr>
-          <w:rFonts w:ascii="LMMono12" w:hAnsi="LMMono12" w:eastAsia="LMMono12"/>
-          <w:b w:val="0"/>
-          <w:i w:val="0"/>
-          <w:color w:val="000000"/>
-          <w:sz w:val="24"/>
-        </w:rPr>
-        <w:t>report</w:t>
-      </w:r>
-      <w:r>
-        <w:rPr>
-          <w:rFonts w:ascii="LMMono12" w:hAnsi="LMMono12" w:eastAsia="LMMono12"/>
-          <w:b w:val="0"/>
-          <w:i w:val="0"/>
-          <w:color w:val="000000"/>
-          <w:sz w:val="24"/>
-        </w:rPr>
-        <w:t>files.</w:t>
-      </w:r>
-    </w:p>
-    <w:p>
-      <w:pPr>
-        <w:autoSpaceDN w:val="0"/>
-        <w:tabs>
-          <w:tab w:pos="2962" w:val="left"/>
-        </w:tabs>
-        <w:autoSpaceDE w:val="0"/>
-        <w:widowControl/>
-        <w:spacing w:line="238" w:lineRule="exact" w:before="40" w:after="0"/>
-        <w:ind w:left="8" w:right="0" w:firstLine="0"/>
-        <w:jc w:val="left"/>
-      </w:pPr>
-      <w:r>
-        <w:rPr>
-          <w:rFonts w:ascii="LMMono12" w:hAnsi="LMMono12" w:eastAsia="LMMono12"/>
-          <w:b w:val="0"/>
-          <w:i w:val="0"/>
-          <w:color w:val="000000"/>
-          <w:sz w:val="24"/>
-        </w:rPr>
-        <w:t xml:space="preserve">scripts/ </w:t>
-      </w:r>
-      <w:r>
-        <w:tab/>
-      </w:r>
-      <w:r>
-        <w:rPr>
-          <w:rFonts w:ascii="LMMono12" w:hAnsi="LMMono12" w:eastAsia="LMMono12"/>
-          <w:b w:val="0"/>
-          <w:i w:val="0"/>
-          <w:color w:val="000000"/>
-          <w:sz w:val="24"/>
-        </w:rPr>
-        <w:t>#</w:t>
-      </w:r>
-      <w:r>
-        <w:rPr>
-          <w:rFonts w:ascii="LMMono12" w:hAnsi="LMMono12" w:eastAsia="LMMono12"/>
-          <w:b w:val="0"/>
-          <w:i w:val="0"/>
-          <w:color w:val="000000"/>
-          <w:sz w:val="24"/>
-        </w:rPr>
-        <w:t>Automation</w:t>
-      </w:r>
-      <w:r>
-        <w:rPr>
-          <w:rFonts w:ascii="LMMono12" w:hAnsi="LMMono12" w:eastAsia="LMMono12"/>
-          <w:b w:val="0"/>
-          <w:i w:val="0"/>
-          <w:color w:val="000000"/>
-          <w:sz w:val="24"/>
-        </w:rPr>
-        <w:t>scripts.</w:t>
-      </w:r>
-    </w:p>
-    <w:p>
-      <w:pPr>
-        <w:autoSpaceDN w:val="0"/>
-        <w:tabs>
-          <w:tab w:pos="500" w:val="left"/>
-          <w:tab w:pos="2962" w:val="left"/>
-        </w:tabs>
-        <w:autoSpaceDE w:val="0"/>
-        <w:widowControl/>
-        <w:spacing w:line="278" w:lineRule="exact" w:before="2" w:after="0"/>
         <w:ind w:left="8" w:right="4032" w:firstLine="0"/>
         <w:jc w:val="left"/>
       </w:pPr>
@@ -9252,7 +9255,7 @@
           <w:color w:val="000000"/>
           <w:sz w:val="24"/>
         </w:rPr>
-        <w:t xml:space="preserve">check_directory_readmes.sh </w:t>
+        <w:t xml:space="preserve">scripts/bin/ckdirectory_guides </w:t>
       </w:r>
       <w:r>
         <w:br/>
@@ -9403,7 +9406,7 @@
               <w:autoSpaceDN w:val="0"/>
               <w:autoSpaceDE w:val="0"/>
               <w:widowControl/>
-              <w:spacing w:line="238" w:lineRule="exact" w:before="20" w:after="0"/>
+              <w:spacing w:line="240" w:lineRule="exact" w:before="20" w:after="0"/>
               <w:ind w:left="4" w:right="0" w:firstLine="0"/>
               <w:jc w:val="left"/>
             </w:pPr>
@@ -9433,7 +9436,7 @@
               <w:autoSpaceDN w:val="0"/>
               <w:autoSpaceDE w:val="0"/>
               <w:widowControl/>
-              <w:spacing w:line="238" w:lineRule="exact" w:before="20" w:after="0"/>
+              <w:spacing w:line="240" w:lineRule="exact" w:before="20" w:after="0"/>
               <w:ind w:left="754" w:right="0" w:firstLine="0"/>
               <w:jc w:val="left"/>
             </w:pPr>
@@ -9526,7 +9529,7 @@
               <w:autoSpaceDN w:val="0"/>
               <w:autoSpaceDE w:val="0"/>
               <w:widowControl/>
-              <w:spacing w:line="240" w:lineRule="exact" w:before="36" w:after="0"/>
+              <w:spacing w:line="238" w:lineRule="exact" w:before="38" w:after="0"/>
               <w:ind w:left="496" w:right="0" w:firstLine="0"/>
               <w:jc w:val="left"/>
             </w:pPr>
@@ -9556,7 +9559,7 @@
               <w:autoSpaceDN w:val="0"/>
               <w:autoSpaceDE w:val="0"/>
               <w:widowControl/>
-              <w:spacing w:line="240" w:lineRule="exact" w:before="36" w:after="0"/>
+              <w:spacing w:line="238" w:lineRule="exact" w:before="38" w:after="0"/>
               <w:ind w:left="754" w:right="0" w:firstLine="0"/>
               <w:jc w:val="left"/>
             </w:pPr>
@@ -9641,7 +9644,7 @@
               <w:autoSpaceDN w:val="0"/>
               <w:autoSpaceDE w:val="0"/>
               <w:widowControl/>
-              <w:spacing w:line="238" w:lineRule="exact" w:before="36" w:after="0"/>
+              <w:spacing w:line="240" w:lineRule="exact" w:before="36" w:after="0"/>
               <w:ind w:left="496" w:right="0" w:firstLine="0"/>
               <w:jc w:val="left"/>
             </w:pPr>
@@ -9671,7 +9674,7 @@
               <w:autoSpaceDN w:val="0"/>
               <w:autoSpaceDE w:val="0"/>
               <w:widowControl/>
-              <w:spacing w:line="238" w:lineRule="exact" w:before="36" w:after="0"/>
+              <w:spacing w:line="240" w:lineRule="exact" w:before="36" w:after="0"/>
               <w:ind w:left="754" w:right="0" w:firstLine="0"/>
               <w:jc w:val="left"/>
             </w:pPr>
@@ -9746,7 +9749,7 @@
               <w:autoSpaceDN w:val="0"/>
               <w:autoSpaceDE w:val="0"/>
               <w:widowControl/>
-              <w:spacing w:line="240" w:lineRule="exact" w:before="34" w:after="0"/>
+              <w:spacing w:line="238" w:lineRule="exact" w:before="36" w:after="0"/>
               <w:ind w:left="496" w:right="0" w:firstLine="0"/>
               <w:jc w:val="left"/>
             </w:pPr>
@@ -9776,7 +9779,7 @@
               <w:autoSpaceDN w:val="0"/>
               <w:autoSpaceDE w:val="0"/>
               <w:widowControl/>
-              <w:spacing w:line="240" w:lineRule="exact" w:before="34" w:after="0"/>
+              <w:spacing w:line="238" w:lineRule="exact" w:before="36" w:after="0"/>
               <w:ind w:left="754" w:right="0" w:firstLine="0"/>
               <w:jc w:val="left"/>
             </w:pPr>
@@ -9851,7 +9854,7 @@
               <w:autoSpaceDN w:val="0"/>
               <w:autoSpaceDE w:val="0"/>
               <w:widowControl/>
-              <w:spacing w:line="238" w:lineRule="exact" w:before="34" w:after="0"/>
+              <w:spacing w:line="240" w:lineRule="exact" w:before="34" w:after="0"/>
               <w:ind w:left="496" w:right="0" w:firstLine="0"/>
               <w:jc w:val="left"/>
             </w:pPr>
@@ -9881,7 +9884,7 @@
               <w:autoSpaceDN w:val="0"/>
               <w:autoSpaceDE w:val="0"/>
               <w:widowControl/>
-              <w:spacing w:line="238" w:lineRule="exact" w:before="34" w:after="0"/>
+              <w:spacing w:line="240" w:lineRule="exact" w:before="34" w:after="0"/>
               <w:ind w:left="754" w:right="0" w:firstLine="0"/>
               <w:jc w:val="left"/>
             </w:pPr>
@@ -9996,7 +9999,7 @@
               <w:autoSpaceDN w:val="0"/>
               <w:autoSpaceDE w:val="0"/>
               <w:widowControl/>
-              <w:spacing w:line="240" w:lineRule="exact" w:before="32" w:after="0"/>
+              <w:spacing w:line="238" w:lineRule="exact" w:before="34" w:after="0"/>
               <w:ind w:left="496" w:right="0" w:firstLine="0"/>
               <w:jc w:val="left"/>
             </w:pPr>
@@ -10026,7 +10029,7 @@
               <w:autoSpaceDN w:val="0"/>
               <w:autoSpaceDE w:val="0"/>
               <w:widowControl/>
-              <w:spacing w:line="240" w:lineRule="exact" w:before="32" w:after="0"/>
+              <w:spacing w:line="238" w:lineRule="exact" w:before="34" w:after="0"/>
               <w:ind w:left="754" w:right="0" w:firstLine="0"/>
               <w:jc w:val="left"/>
             </w:pPr>
@@ -10095,7 +10098,7 @@
       </w:tr>
       <w:tr>
         <w:trPr>
-          <w:trHeight w:hRule="exact" w:val="3574"/>
+          <w:trHeight w:hRule="exact" w:val="3854"/>
         </w:trPr>
         <w:tc>
           <w:tcPr>
@@ -10113,7 +10116,7 @@
               <w:autoSpaceDN w:val="0"/>
               <w:autoSpaceDE w:val="0"/>
               <w:widowControl/>
-              <w:spacing w:line="238" w:lineRule="exact" w:before="32" w:after="0"/>
+              <w:spacing w:line="240" w:lineRule="exact" w:before="32" w:after="0"/>
               <w:ind w:left="496" w:right="0" w:firstLine="0"/>
               <w:jc w:val="left"/>
             </w:pPr>
@@ -10145,7 +10148,7 @@
               <w:autoSpaceDN w:val="0"/>
               <w:autoSpaceDE w:val="0"/>
               <w:widowControl/>
-              <w:spacing w:line="238" w:lineRule="exact" w:before="32" w:after="0"/>
+              <w:spacing w:line="240" w:lineRule="exact" w:before="32" w:after="0"/>
               <w:ind w:left="754" w:right="0" w:firstLine="0"/>
               <w:jc w:val="left"/>
             </w:pPr>

</xml_diff>

<commit_message>
Update generated documentation files
</commit_message>
<xml_diff>
--- a/docs/docx/Documentation_Guide.docx
+++ b/docs/docx/Documentation_Guide.docx
@@ -15,7 +15,7 @@
         <w:pStyle w:val="FirstParagraph"/>
       </w:pPr>
       <w:r>
-        <w:t xml:space="preserve">This document is a guide to the BriteTest documentation and</w:t>
+        <w:t xml:space="preserve">This document is a guide to the briteTest documentation and</w:t>
       </w:r>
       <w:r>
         <w:t xml:space="preserve"> </w:t>
@@ -718,7 +718,7 @@
         <w:t xml:space="preserve">Contributors</w:t>
       </w:r>
       <w:r>
-        <w:t xml:space="preserve">; Guide and API internal documents.</w:t>
+        <w:t xml:space="preserve">: Contributor Guide and API internal documents.</w:t>
       </w:r>
     </w:p>
     <w:p>
@@ -744,7 +744,31 @@
         <w:t xml:space="preserve">README</w:t>
       </w:r>
       <w:r>
-        <w:t xml:space="preserve">: Introduction or description.</w:t>
+        <w:t xml:space="preserve">:</w:t>
+      </w:r>
+    </w:p>
+    <w:p>
+      <w:pPr>
+        <w:numPr>
+          <w:ilvl w:val="1"/>
+          <w:numId w:val="1004"/>
+        </w:numPr>
+        <w:pStyle w:val="Compact"/>
+      </w:pPr>
+      <w:r>
+        <w:t xml:space="preserve">In root, link to the /docs/md/briteTest_Guide,md file.</w:t>
+      </w:r>
+    </w:p>
+    <w:p>
+      <w:pPr>
+        <w:numPr>
+          <w:ilvl w:val="1"/>
+          <w:numId w:val="1004"/>
+        </w:numPr>
+        <w:pStyle w:val="Compact"/>
+      </w:pPr>
+      <w:r>
+        <w:t xml:space="preserve">In a subdirectory of root, a directory guide.</w:t>
       </w:r>
     </w:p>
     <w:p>
@@ -795,7 +819,7 @@
       <w:pPr>
         <w:numPr>
           <w:ilvl w:val="0"/>
-          <w:numId w:val="1004"/>
+          <w:numId w:val="1005"/>
         </w:numPr>
       </w:pPr>
       <w:r>
@@ -806,70 +830,13 @@
         <w:t xml:space="preserve">.md</w:t>
       </w:r>
       <w:r>
-        <w:t xml:space="preserve">: Markdown documentation format for online viewing.</w:t>
-      </w:r>
-    </w:p>
-    <w:p>
-      <w:pPr>
-        <w:numPr>
-          <w:ilvl w:val="0"/>
-          <w:numId w:val="1004"/>
-        </w:numPr>
-      </w:pPr>
-      <w:r>
-        <w:rPr>
-          <w:bCs/>
-          <w:b/>
-        </w:rPr>
-        <w:t xml:space="preserve">.pdf</w:t>
-      </w:r>
-      <w:r>
-        <w:t xml:space="preserve">: Portable Document Format for printing. A BriteTest .pdf file is generated</w:t>
-      </w:r>
-      <w:r>
-        <w:t xml:space="preserve"> </w:t>
-      </w:r>
-      <w:r>
-        <w:t xml:space="preserve">from a BriteTest .md file using genpdf in the scripts directory of the repository</w:t>
-      </w:r>
-      <w:r>
-        <w:t xml:space="preserve"> </w:t>
-      </w:r>
-      <w:r>
-        <w:t xml:space="preserve">root.</w:t>
-      </w:r>
-    </w:p>
-    <w:bookmarkEnd w:id="25"/>
-    <w:bookmarkStart w:id="26" w:name="documents"/>
-    <w:p>
-      <w:pPr>
-        <w:pStyle w:val="Heading2"/>
-      </w:pPr>
-      <w:r>
-        <w:t xml:space="preserve">2. Documents</w:t>
-      </w:r>
-    </w:p>
-    <w:p>
-      <w:pPr>
-        <w:pStyle w:val="FirstParagraph"/>
-      </w:pPr>
-      <w:r>
-        <w:t xml:space="preserve">The following are the user and contributor documents.</w:t>
-      </w:r>
-    </w:p>
-    <w:p>
-      <w:pPr>
-        <w:pStyle w:val="BodyText"/>
-      </w:pPr>
-      <w:r>
-        <w:rPr>
-          <w:bCs/>
-          <w:b/>
-        </w:rPr>
-        <w:t xml:space="preserve">User documentation</w:t>
-      </w:r>
-      <w:r>
-        <w:t xml:space="preserve">:</w:t>
+        <w:t xml:space="preserve">: Markdown format for online viewing and the base/master</w:t>
+      </w:r>
+      <w:r>
+        <w:t xml:space="preserve"> </w:t>
+      </w:r>
+      <w:r>
+        <w:t xml:space="preserve">from which to generate .pdf and .docx format files.</w:t>
       </w:r>
     </w:p>
     <w:p>
@@ -884,13 +851,16 @@
           <w:bCs/>
           <w:b/>
         </w:rPr>
-        <w:t xml:space="preserve">README.md</w:t>
-      </w:r>
-      <w:r>
-        <w:t xml:space="preserve"> </w:t>
-      </w:r>
-      <w:r>
-        <w:t xml:space="preserve">– Introduction to BriteTest.</w:t>
+        <w:t xml:space="preserve">.pdf</w:t>
+      </w:r>
+      <w:r>
+        <w:t xml:space="preserve">: Portable Document Format useful as a portable and printable</w:t>
+      </w:r>
+      <w:r>
+        <w:t xml:space="preserve"> </w:t>
+      </w:r>
+      <w:r>
+        <w:t xml:space="preserve">form of a document. A .pdf file is generated from an .md file.</w:t>
       </w:r>
     </w:p>
     <w:p>
@@ -905,148 +875,46 @@
           <w:bCs/>
           <w:b/>
         </w:rPr>
-        <w:t xml:space="preserve">Documentation_Guide.md</w:t>
-      </w:r>
-      <w:r>
-        <w:t xml:space="preserve">: A guide to documents and the</w:t>
-      </w:r>
-      <w:r>
-        <w:t xml:space="preserve"> </w:t>
-      </w:r>
-      <w:r>
-        <w:t xml:space="preserve">repository layout.</w:t>
-      </w:r>
-    </w:p>
-    <w:p>
-      <w:pPr>
-        <w:numPr>
-          <w:ilvl w:val="0"/>
-          <w:numId w:val="1005"/>
-        </w:numPr>
+        <w:t xml:space="preserve">.docx</w:t>
+      </w:r>
+      <w:r>
+        <w:t xml:space="preserve">: MS Word DOCX format. A briteTest .docx file is generated</w:t>
+      </w:r>
+      <w:r>
+        <w:t xml:space="preserve"> </w:t>
+      </w:r>
+      <w:r>
+        <w:t xml:space="preserve">from a .pdf file.</w:t>
+      </w:r>
+    </w:p>
+    <w:bookmarkEnd w:id="25"/>
+    <w:bookmarkStart w:id="26" w:name="documents"/>
+    <w:p>
+      <w:pPr>
+        <w:pStyle w:val="Heading2"/>
+      </w:pPr>
+      <w:r>
+        <w:t xml:space="preserve">2. Documents</w:t>
+      </w:r>
+    </w:p>
+    <w:p>
+      <w:pPr>
+        <w:pStyle w:val="FirstParagraph"/>
+      </w:pPr>
+      <w:r>
+        <w:t xml:space="preserve">The following are the user and contributor documents:</w:t>
+      </w:r>
+    </w:p>
+    <w:p>
+      <w:pPr>
+        <w:pStyle w:val="BodyText"/>
       </w:pPr>
       <w:r>
         <w:rPr>
           <w:bCs/>
           <w:b/>
         </w:rPr>
-        <w:t xml:space="preserve">Glossary_Reference.md</w:t>
-      </w:r>
-      <w:r>
-        <w:t xml:space="preserve">: An alphabetically ordered list of terms</w:t>
-      </w:r>
-      <w:r>
-        <w:t xml:space="preserve"> </w:t>
-      </w:r>
-      <w:r>
-        <w:t xml:space="preserve">generally used in the documentation (emphasizing their specific meaning in</w:t>
-      </w:r>
-      <w:r>
-        <w:t xml:space="preserve"> </w:t>
-      </w:r>
-      <w:r>
-        <w:t xml:space="preserve">BriteTest) and terms often used in the testing domain.</w:t>
-      </w:r>
-    </w:p>
-    <w:p>
-      <w:pPr>
-        <w:numPr>
-          <w:ilvl w:val="0"/>
-          <w:numId w:val="1005"/>
-        </w:numPr>
-      </w:pPr>
-      <w:r>
-        <w:rPr>
-          <w:bCs/>
-          <w:b/>
-        </w:rPr>
-        <w:t xml:space="preserve">Runner_Guide.md</w:t>
-      </w:r>
-      <w:r>
-        <w:t xml:space="preserve">: Concepts, usage, and examples for</w:t>
-      </w:r>
-      <w:r>
-        <w:t xml:space="preserve"> </w:t>
-      </w:r>
-      <w:r>
-        <w:t xml:space="preserve">the Runner Framework and API.</w:t>
-      </w:r>
-    </w:p>
-    <w:p>
-      <w:pPr>
-        <w:numPr>
-          <w:ilvl w:val="0"/>
-          <w:numId w:val="1005"/>
-        </w:numPr>
-      </w:pPr>
-      <w:r>
-        <w:rPr>
-          <w:bCs/>
-          <w:b/>
-        </w:rPr>
-        <w:t xml:space="preserve">Runner_Reference.md</w:t>
-      </w:r>
-      <w:r>
-        <w:t xml:space="preserve">: Reference document for the</w:t>
-      </w:r>
-      <w:r>
-        <w:t xml:space="preserve"> </w:t>
-      </w:r>
-      <w:r>
-        <w:t xml:space="preserve">Runner API.</w:t>
-      </w:r>
-    </w:p>
-    <w:p>
-      <w:pPr>
-        <w:numPr>
-          <w:ilvl w:val="0"/>
-          <w:numId w:val="1005"/>
-        </w:numPr>
-      </w:pPr>
-      <w:r>
-        <w:rPr>
-          <w:bCs/>
-          <w:b/>
-        </w:rPr>
-        <w:t xml:space="preserve">Test_Guide.md</w:t>
-      </w:r>
-      <w:r>
-        <w:t xml:space="preserve">: Concepts, usage, and examples for</w:t>
-      </w:r>
-      <w:r>
-        <w:t xml:space="preserve"> </w:t>
-      </w:r>
-      <w:r>
-        <w:t xml:space="preserve">the Test API.</w:t>
-      </w:r>
-    </w:p>
-    <w:p>
-      <w:pPr>
-        <w:numPr>
-          <w:ilvl w:val="0"/>
-          <w:numId w:val="1005"/>
-        </w:numPr>
-      </w:pPr>
-      <w:r>
-        <w:rPr>
-          <w:bCs/>
-          <w:b/>
-        </w:rPr>
-        <w:t xml:space="preserve">Test_Reference.md</w:t>
-      </w:r>
-      <w:r>
-        <w:t xml:space="preserve">: Reference document for the Test API.</w:t>
-      </w:r>
-    </w:p>
-    <w:p>
-      <w:pPr>
-        <w:pStyle w:val="FirstParagraph"/>
-      </w:pPr>
-      <w:r>
-        <w:rPr>
-          <w:bCs/>
-          <w:b/>
-        </w:rPr>
-        <w:t xml:space="preserve">Contributor documentation</w:t>
+        <w:t xml:space="preserve">User documentation</w:t>
       </w:r>
       <w:r>
         <w:t xml:space="preserve">:</w:t>
@@ -1064,10 +932,16 @@
           <w:bCs/>
           <w:b/>
         </w:rPr>
-        <w:t xml:space="preserve">README.md</w:t>
-      </w:r>
-      <w:r>
-        <w:t xml:space="preserve">: Directory description, one for each subdirectory.</w:t>
+        <w:t xml:space="preserve">Documentation_Guide.md</w:t>
+      </w:r>
+      <w:r>
+        <w:t xml:space="preserve">: A guide to documents and the</w:t>
+      </w:r>
+      <w:r>
+        <w:t xml:space="preserve"> </w:t>
+      </w:r>
+      <w:r>
+        <w:t xml:space="preserve">repository layout.</w:t>
       </w:r>
     </w:p>
     <w:p>
@@ -1082,16 +956,22 @@
           <w:bCs/>
           <w:b/>
         </w:rPr>
-        <w:t xml:space="preserve">Contributor_Guide.md</w:t>
-      </w:r>
-      <w:r>
-        <w:t xml:space="preserve">: Versioning, documentation/coding</w:t>
-      </w:r>
-      <w:r>
-        <w:t xml:space="preserve"> </w:t>
-      </w:r>
-      <w:r>
-        <w:t xml:space="preserve">guidelines, branching, testing, and CI/release checklists.</w:t>
+        <w:t xml:space="preserve">Glossary_Reference.md</w:t>
+      </w:r>
+      <w:r>
+        <w:t xml:space="preserve">: An alphabetically ordered list of terms</w:t>
+      </w:r>
+      <w:r>
+        <w:t xml:space="preserve"> </w:t>
+      </w:r>
+      <w:r>
+        <w:t xml:space="preserve">generally used in the documentation (emphasizing their specific meaning in</w:t>
+      </w:r>
+      <w:r>
+        <w:t xml:space="preserve"> </w:t>
+      </w:r>
+      <w:r>
+        <w:t xml:space="preserve">briteTest) and terms often used in the testing domain.</w:t>
       </w:r>
     </w:p>
     <w:p>
@@ -1106,16 +986,13 @@
           <w:bCs/>
           <w:b/>
         </w:rPr>
-        <w:t xml:space="preserve">Runner_Internal_Guide.md</w:t>
-      </w:r>
-      <w:r>
-        <w:t xml:space="preserve">: Implementation concepts,</w:t>
-      </w:r>
-      <w:r>
-        <w:t xml:space="preserve"> </w:t>
-      </w:r>
-      <w:r>
-        <w:t xml:space="preserve">architecture, and high-level design for the Runner API.</w:t>
+        <w:t xml:space="preserve">Guide.md</w:t>
+      </w:r>
+      <w:r>
+        <w:t xml:space="preserve"> </w:t>
+      </w:r>
+      <w:r>
+        <w:t xml:space="preserve">– briteTest concepts and quick start example.</w:t>
       </w:r>
     </w:p>
     <w:p>
@@ -1130,16 +1007,16 @@
           <w:bCs/>
           <w:b/>
         </w:rPr>
-        <w:t xml:space="preserve">Runner_Internal_Reference.md</w:t>
-      </w:r>
-      <w:r>
-        <w:t xml:space="preserve">: Reference for the</w:t>
-      </w:r>
-      <w:r>
-        <w:t xml:space="preserve"> </w:t>
-      </w:r>
-      <w:r>
-        <w:t xml:space="preserve">implementation of the Runner API.</w:t>
+        <w:t xml:space="preserve">Runner_Guide.md</w:t>
+      </w:r>
+      <w:r>
+        <w:t xml:space="preserve">: Concepts, usage, and examples for</w:t>
+      </w:r>
+      <w:r>
+        <w:t xml:space="preserve"> </w:t>
+      </w:r>
+      <w:r>
+        <w:t xml:space="preserve">the Runner Framework and API.</w:t>
       </w:r>
     </w:p>
     <w:p>
@@ -1154,16 +1031,16 @@
           <w:bCs/>
           <w:b/>
         </w:rPr>
-        <w:t xml:space="preserve">Test_Internal_Guide.md</w:t>
-      </w:r>
-      <w:r>
-        <w:t xml:space="preserve">: Implementation concepts,</w:t>
-      </w:r>
-      <w:r>
-        <w:t xml:space="preserve"> </w:t>
-      </w:r>
-      <w:r>
-        <w:t xml:space="preserve">architecture, and high-level design for the Test API.</w:t>
+        <w:t xml:space="preserve">Runner_Reference.md</w:t>
+      </w:r>
+      <w:r>
+        <w:t xml:space="preserve">: Reference document for the</w:t>
+      </w:r>
+      <w:r>
+        <w:t xml:space="preserve"> </w:t>
+      </w:r>
+      <w:r>
+        <w:t xml:space="preserve">Runner API.</w:t>
       </w:r>
     </w:p>
     <w:p>
@@ -1178,6 +1055,159 @@
           <w:bCs/>
           <w:b/>
         </w:rPr>
+        <w:t xml:space="preserve">Test_Guide.md</w:t>
+      </w:r>
+      <w:r>
+        <w:t xml:space="preserve">: Concepts, usage, and examples for</w:t>
+      </w:r>
+      <w:r>
+        <w:t xml:space="preserve"> </w:t>
+      </w:r>
+      <w:r>
+        <w:t xml:space="preserve">the Test API.</w:t>
+      </w:r>
+    </w:p>
+    <w:p>
+      <w:pPr>
+        <w:numPr>
+          <w:ilvl w:val="0"/>
+          <w:numId w:val="1006"/>
+        </w:numPr>
+      </w:pPr>
+      <w:r>
+        <w:rPr>
+          <w:bCs/>
+          <w:b/>
+        </w:rPr>
+        <w:t xml:space="preserve">Test_Reference.md</w:t>
+      </w:r>
+      <w:r>
+        <w:t xml:space="preserve">: Reference document for the Test API.</w:t>
+      </w:r>
+    </w:p>
+    <w:p>
+      <w:pPr>
+        <w:pStyle w:val="FirstParagraph"/>
+      </w:pPr>
+      <w:r>
+        <w:rPr>
+          <w:bCs/>
+          <w:b/>
+        </w:rPr>
+        <w:t xml:space="preserve">Contributor documentation</w:t>
+      </w:r>
+      <w:r>
+        <w:t xml:space="preserve">:</w:t>
+      </w:r>
+    </w:p>
+    <w:p>
+      <w:pPr>
+        <w:numPr>
+          <w:ilvl w:val="0"/>
+          <w:numId w:val="1007"/>
+        </w:numPr>
+      </w:pPr>
+      <w:r>
+        <w:rPr>
+          <w:bCs/>
+          <w:b/>
+        </w:rPr>
+        <w:t xml:space="preserve">Contributor_Guide.md</w:t>
+      </w:r>
+      <w:r>
+        <w:t xml:space="preserve">: Versioning, documentation/coding</w:t>
+      </w:r>
+      <w:r>
+        <w:t xml:space="preserve"> </w:t>
+      </w:r>
+      <w:r>
+        <w:t xml:space="preserve">guidelines, branching, testing, and CI/release checklists.</w:t>
+      </w:r>
+    </w:p>
+    <w:p>
+      <w:pPr>
+        <w:numPr>
+          <w:ilvl w:val="0"/>
+          <w:numId w:val="1007"/>
+        </w:numPr>
+      </w:pPr>
+      <w:r>
+        <w:rPr>
+          <w:bCs/>
+          <w:b/>
+        </w:rPr>
+        <w:t xml:space="preserve">Runner_Internal_Guide.md</w:t>
+      </w:r>
+      <w:r>
+        <w:t xml:space="preserve">: Implementation concepts,</w:t>
+      </w:r>
+      <w:r>
+        <w:t xml:space="preserve"> </w:t>
+      </w:r>
+      <w:r>
+        <w:t xml:space="preserve">architecture, and high-level design for the Runner API.</w:t>
+      </w:r>
+    </w:p>
+    <w:p>
+      <w:pPr>
+        <w:numPr>
+          <w:ilvl w:val="0"/>
+          <w:numId w:val="1007"/>
+        </w:numPr>
+      </w:pPr>
+      <w:r>
+        <w:rPr>
+          <w:bCs/>
+          <w:b/>
+        </w:rPr>
+        <w:t xml:space="preserve">Runner_Internal_Reference.md</w:t>
+      </w:r>
+      <w:r>
+        <w:t xml:space="preserve">: Reference for the</w:t>
+      </w:r>
+      <w:r>
+        <w:t xml:space="preserve"> </w:t>
+      </w:r>
+      <w:r>
+        <w:t xml:space="preserve">implementation of the Runner API.</w:t>
+      </w:r>
+    </w:p>
+    <w:p>
+      <w:pPr>
+        <w:numPr>
+          <w:ilvl w:val="0"/>
+          <w:numId w:val="1007"/>
+        </w:numPr>
+      </w:pPr>
+      <w:r>
+        <w:rPr>
+          <w:bCs/>
+          <w:b/>
+        </w:rPr>
+        <w:t xml:space="preserve">Test_Internal_Guide.md</w:t>
+      </w:r>
+      <w:r>
+        <w:t xml:space="preserve">: Implementation concepts,</w:t>
+      </w:r>
+      <w:r>
+        <w:t xml:space="preserve"> </w:t>
+      </w:r>
+      <w:r>
+        <w:t xml:space="preserve">architecture, and high-level design for the Test API.</w:t>
+      </w:r>
+    </w:p>
+    <w:p>
+      <w:pPr>
+        <w:numPr>
+          <w:ilvl w:val="0"/>
+          <w:numId w:val="1007"/>
+        </w:numPr>
+      </w:pPr>
+      <w:r>
+        <w:rPr>
+          <w:bCs/>
+          <w:b/>
+        </w:rPr>
         <w:t xml:space="preserve">Test_Internal_Reference.md</w:t>
       </w:r>
       <w:r>
@@ -1276,7 +1306,7 @@
         <w:rPr>
           <w:rStyle w:val="VerbatimChar"/>
         </w:rPr>
-        <w:t xml:space="preserve">README.md</w:t>
+        <w:t xml:space="preserve">README.md.              # Link to /docs/md/Guide.md,</w:t>
       </w:r>
       <w:r>
         <w:br/>
@@ -1330,16 +1360,16 @@
         <w:rPr>
           <w:rStyle w:val="VerbatimChar"/>
         </w:rPr>
-        <w:t xml:space="preserve">    branding/           # Monograms, logos, and document logos.</w:t>
-      </w:r>
-      <w:r>
-        <w:br/>
-      </w:r>
-      <w:r>
-        <w:rPr>
-          <w:rStyle w:val="VerbatimChar"/>
-        </w:rPr>
-        <w:t xml:space="preserve">    md/                 # `*.md` files (base documentation).</w:t>
+        <w:t xml:space="preserve">    branding/           # Monograms, logos, and document title logos.</w:t>
+      </w:r>
+      <w:r>
+        <w:br/>
+      </w:r>
+      <w:r>
+        <w:rPr>
+          <w:rStyle w:val="VerbatimChar"/>
+        </w:rPr>
+        <w:t xml:space="preserve">    md/                 # `*.md` files (base/master documentation).</w:t>
       </w:r>
       <w:r>
         <w:br/>
@@ -1733,6 +1763,9 @@
     <w:abstractNumId w:val="991"/>
   </w:num>
   <w:num w:numId="1006">
+    <w:abstractNumId w:val="991"/>
+  </w:num>
+  <w:num w:numId="1007">
     <w:abstractNumId w:val="991"/>
   </w:num>
 </w:numbering>

</xml_diff>